<commit_message>
Update document template and stabilize document layout
</commit_message>
<xml_diff>
--- a/backend/app/templates/documents/crypto_individual_payment_order_act.docx
+++ b/backend/app/templates/documents/crypto_individual_payment_order_act.docx
@@ -1,6 +1,6 @@
 
 <file path=word/document.xml><?xml version="1.0" encoding="utf-8"?>
-<w:document xmlns:wpc="http://schemas.microsoft.com/office/word/2010/wordprocessingCanvas" xmlns:cx="http://schemas.microsoft.com/office/drawing/2014/chartex" xmlns:cx1="http://schemas.microsoft.com/office/drawing/2015/9/8/chartex" xmlns:cx2="http://schemas.microsoft.com/office/drawing/2015/10/21/chartex" xmlns:cx3="http://schemas.microsoft.com/office/drawing/2016/5/9/chartex" xmlns:cx4="http://schemas.microsoft.com/office/drawing/2016/5/10/chartex" xmlns:cx5="http://schemas.microsoft.com/office/drawing/2016/5/11/chartex" xmlns:cx6="http://schemas.microsoft.com/office/drawing/2016/5/12/chartex" xmlns:cx7="http://schemas.microsoft.com/office/drawing/2016/5/13/chartex" xmlns:cx8="http://schemas.microsoft.com/office/drawing/2016/5/14/chartex" xmlns:mc="http://schemas.openxmlformats.org/markup-compatibility/2006" xmlns:aink="http://schemas.microsoft.com/office/drawing/2016/ink" xmlns:am3d="http://schemas.microsoft.com/office/drawing/2017/model3d" xmlns:o="urn:schemas-microsoft-com:office:office" xmlns:oel="http://schemas.microsoft.com/office/2019/extlst" xmlns:r="http://schemas.openxmlformats.org/officeDocument/2006/relationships" xmlns:m="http://schemas.openxmlformats.org/officeDocument/2006/math" xmlns:v="urn:schemas-microsoft-com:vml" xmlns:wp14="http://schemas.microsoft.com/office/word/2010/wordprocessingDrawing" xmlns:wp="http://schemas.openxmlformats.org/drawingml/2006/wordprocessingDrawing" xmlns:w10="urn:schemas-microsoft-com:office:word" xmlns:w="http://schemas.openxmlformats.org/wordprocessingml/2006/main" xmlns:w14="http://schemas.microsoft.com/office/word/2010/wordml" xmlns:w15="http://schemas.microsoft.com/office/word/2012/wordml" xmlns:w16cex="http://schemas.microsoft.com/office/word/2018/wordml/cex" xmlns:w16cid="http://schemas.microsoft.com/office/word/2016/wordml/cid" xmlns:w16="http://schemas.microsoft.com/office/word/2018/wordml" xmlns:w16du="http://schemas.microsoft.com/office/word/2023/wordml/word16du" xmlns:w16sdtdh="http://schemas.microsoft.com/office/word/2020/wordml/sdtdatahash" xmlns:w16sdtfl="http://schemas.microsoft.com/office/word/2024/wordml/sdtformatlock" xmlns:w16se="http://schemas.microsoft.com/office/word/2015/wordml/symex" xmlns:wpg="http://schemas.microsoft.com/office/word/2010/wordprocessingGroup" xmlns:wpi="http://schemas.microsoft.com/office/word/2010/wordprocessingInk" xmlns:wne="http://schemas.microsoft.com/office/word/2006/wordml" xmlns:wps="http://schemas.microsoft.com/office/word/2010/wordprocessingShape" mc:Ignorable="w14 w15 w16se w16cid w16 w16cex w16sdtdh w16sdtfl w16du wp14">
+<w:document xmlns:wpc="http://schemas.microsoft.com/office/word/2010/wordprocessingCanvas" xmlns:cx="http://schemas.microsoft.com/office/drawing/2014/chartex" xmlns:cx1="http://schemas.microsoft.com/office/drawing/2015/9/8/chartex" xmlns:cx2="http://schemas.microsoft.com/office/drawing/2015/10/21/chartex" xmlns:cx3="http://schemas.microsoft.com/office/drawing/2016/5/9/chartex" xmlns:cx4="http://schemas.microsoft.com/office/drawing/2016/5/10/chartex" xmlns:cx5="http://schemas.microsoft.com/office/drawing/2016/5/11/chartex" xmlns:cx6="http://schemas.microsoft.com/office/drawing/2016/5/12/chartex" xmlns:cx7="http://schemas.microsoft.com/office/drawing/2016/5/13/chartex" xmlns:cx8="http://schemas.microsoft.com/office/drawing/2016/5/14/chartex" xmlns:mc="http://schemas.openxmlformats.org/markup-compatibility/2006" xmlns:aink="http://schemas.microsoft.com/office/drawing/2016/ink" xmlns:am3d="http://schemas.microsoft.com/office/drawing/2017/model3d" xmlns:o="urn:schemas-microsoft-com:office:office" xmlns:r="http://schemas.openxmlformats.org/officeDocument/2006/relationships" xmlns:m="http://schemas.openxmlformats.org/officeDocument/2006/math" xmlns:v="urn:schemas-microsoft-com:vml" xmlns:wp14="http://schemas.microsoft.com/office/word/2010/wordprocessingDrawing" xmlns:wp="http://schemas.openxmlformats.org/drawingml/2006/wordprocessingDrawing" xmlns:w10="urn:schemas-microsoft-com:office:word" xmlns:w="http://schemas.openxmlformats.org/wordprocessingml/2006/main" xmlns:w14="http://schemas.microsoft.com/office/word/2010/wordml" xmlns:w15="http://schemas.microsoft.com/office/word/2012/wordml" xmlns:w16cex="http://schemas.microsoft.com/office/word/2018/wordml/cex" xmlns:w16cid="http://schemas.microsoft.com/office/word/2016/wordml/cid" xmlns:w16="http://schemas.microsoft.com/office/word/2018/wordml" xmlns:w16sdtdh="http://schemas.microsoft.com/office/word/2020/wordml/sdtdatahash" xmlns:w16se="http://schemas.microsoft.com/office/word/2015/wordml/symex" xmlns:wpg="http://schemas.microsoft.com/office/word/2010/wordprocessingGroup" xmlns:wpi="http://schemas.microsoft.com/office/word/2010/wordprocessingInk" xmlns:wne="http://schemas.microsoft.com/office/word/2006/wordml" xmlns:wps="http://schemas.microsoft.com/office/word/2010/wordprocessingShape" mc:Ignorable="w14 w15 w16se w16cid w16 w16cex w16sdtdh wp14">
   <w:body>
     <w:p>
       <w:pPr>
@@ -42,8 +42,10 @@
           <w:szCs w:val="18"/>
           <w:lang w:eastAsia="ru-RU"/>
         </w:rPr>
-        <w:t>${payment.number}</w:t>
-      </w:r>
+        <w:t>${</w:t>
+      </w:r>
+      <w:proofErr w:type="spellStart"/>
+      <w:proofErr w:type="gramStart"/>
       <w:r>
         <w:rPr>
           <w:rFonts w:ascii="Times New Roman" w:eastAsia="Times New Roman" w:hAnsi="Times New Roman" w:cs="Times New Roman"/>
@@ -52,8 +54,10 @@
           <w:szCs w:val="18"/>
           <w:lang w:eastAsia="ru-RU"/>
         </w:rPr>
-        <w:t xml:space="preserve"> </w:t>
-      </w:r>
+        <w:t>payment.number</w:t>
+      </w:r>
+      <w:proofErr w:type="spellEnd"/>
+      <w:proofErr w:type="gramEnd"/>
       <w:r>
         <w:rPr>
           <w:rFonts w:ascii="Times New Roman" w:eastAsia="Times New Roman" w:hAnsi="Times New Roman" w:cs="Times New Roman"/>
@@ -62,7 +66,7 @@
           <w:szCs w:val="18"/>
           <w:lang w:eastAsia="ru-RU"/>
         </w:rPr>
-        <w:t>ОТ</w:t>
+        <w:t>}</w:t>
       </w:r>
       <w:r>
         <w:rPr>
@@ -82,7 +86,49 @@
           <w:szCs w:val="18"/>
           <w:lang w:eastAsia="ru-RU"/>
         </w:rPr>
-        <w:t>${payment.date}</w:t>
+        <w:t>ОТ</w:t>
+      </w:r>
+      <w:r>
+        <w:rPr>
+          <w:rFonts w:ascii="Times New Roman" w:eastAsia="Times New Roman" w:hAnsi="Times New Roman" w:cs="Times New Roman"/>
+          <w:b/>
+          <w:sz w:val="18"/>
+          <w:szCs w:val="18"/>
+          <w:lang w:eastAsia="ru-RU"/>
+        </w:rPr>
+        <w:t xml:space="preserve"> </w:t>
+      </w:r>
+      <w:r>
+        <w:rPr>
+          <w:rFonts w:ascii="Times New Roman" w:eastAsia="Times New Roman" w:hAnsi="Times New Roman" w:cs="Times New Roman"/>
+          <w:b/>
+          <w:sz w:val="18"/>
+          <w:szCs w:val="18"/>
+          <w:lang w:eastAsia="ru-RU"/>
+        </w:rPr>
+        <w:t>${</w:t>
+      </w:r>
+      <w:proofErr w:type="spellStart"/>
+      <w:r>
+        <w:rPr>
+          <w:rFonts w:ascii="Times New Roman" w:eastAsia="Times New Roman" w:hAnsi="Times New Roman" w:cs="Times New Roman"/>
+          <w:b/>
+          <w:sz w:val="18"/>
+          <w:szCs w:val="18"/>
+          <w:lang w:eastAsia="ru-RU"/>
+        </w:rPr>
+        <w:t>payment.date</w:t>
+      </w:r>
+      <w:proofErr w:type="spellEnd"/>
+      <w:r>
+        <w:rPr>
+          <w:rFonts w:ascii="Times New Roman" w:eastAsia="Times New Roman" w:hAnsi="Times New Roman" w:cs="Times New Roman"/>
+          <w:b/>
+          <w:sz w:val="18"/>
+          <w:szCs w:val="18"/>
+          <w:lang w:eastAsia="ru-RU"/>
+        </w:rPr>
+        <w:t>}</w:t>
       </w:r>
     </w:p>
     <w:p>
@@ -161,7 +207,25 @@
           <w:sz w:val="18"/>
           <w:szCs w:val="18"/>
         </w:rPr>
-        <w:t>Настоящим Клиент поручает Агенту в рамках Оферты, указанной в настоящем документе, совершить от имени Агента, но за счет Клиента, необходимые действия, направленные на приобретение цифровой валюты USDT (Tether) за денежные средства Клиента в валюте Российской Федерации в размере, указанном в разделе 2 настоящего Поручения.</w:t>
+        <w:t>Настоящим Клиент поручает Агенту в рамках Оферты, указанной в настоящем документе, совершить от имени Агента, но за счет Клиента, необходимые действия, направленные на приобретение цифровой валюты USDT (</w:t>
+      </w:r>
+      <w:proofErr w:type="spellStart"/>
+      <w:r>
+        <w:rPr>
+          <w:rFonts w:ascii="Times New Roman" w:hAnsi="Times New Roman" w:cs="Times New Roman"/>
+          <w:sz w:val="18"/>
+          <w:szCs w:val="18"/>
+        </w:rPr>
+        <w:t>Tether</w:t>
+      </w:r>
+      <w:proofErr w:type="spellEnd"/>
+      <w:r>
+        <w:rPr>
+          <w:rFonts w:ascii="Times New Roman" w:hAnsi="Times New Roman" w:cs="Times New Roman"/>
+          <w:sz w:val="18"/>
+          <w:szCs w:val="18"/>
+        </w:rPr>
+        <w:t>) за денежные средства Клиента в валюте Российской Федерации в размере, указанном в разделе 2 настоящего Поручения.</w:t>
       </w:r>
     </w:p>
     <w:p>
@@ -247,15 +311,51 @@
           <w:sz w:val="18"/>
           <w:szCs w:val="18"/>
         </w:rPr>
-        <w:t xml:space="preserve">Клиент подтверждает, что сумма цифровой валюты USDT, подлежащая передаче Клиенту по результатам исполнения настоящего Поручения, в настоящем документе не фиксируется. Итоговая сумма цифровой валюты определяется по фактическим условиям исполнения операции с учетом применимого курса, комиссии Агента, расходов, связанных с исполнением операции, особенностей работы банков, платежных посредников, бирж, обменных сервисов, блокчейн-сетей и иных лиц, участвующих в исполнении операции и переводится на след № эл. кошелька </w:t>
-      </w:r>
-      <w:r>
-        <w:rPr>
-          <w:rFonts w:ascii="Times New Roman" w:hAnsi="Times New Roman" w:cs="Times New Roman"/>
-          <w:sz w:val="18"/>
-          <w:szCs w:val="18"/>
-        </w:rPr>
-        <w:t>${paymentCustom.e_wallet}</w:t>
+        <w:t xml:space="preserve">Клиент подтверждает, что сумма цифровой валюты USDT, подлежащая передаче Клиенту по результатам исполнения настоящего Поручения, в настоящем документе не фиксируется. Итоговая сумма цифровой валюты определяется по фактическим условиям исполнения операции с учетом применимого курса, комиссии Агента, расходов, связанных с исполнением операции, особенностей работы банков, платежных посредников, бирж, обменных сервисов, </w:t>
+      </w:r>
+      <w:proofErr w:type="spellStart"/>
+      <w:r>
+        <w:rPr>
+          <w:rFonts w:ascii="Times New Roman" w:hAnsi="Times New Roman" w:cs="Times New Roman"/>
+          <w:sz w:val="18"/>
+          <w:szCs w:val="18"/>
+        </w:rPr>
+        <w:t>блокчейн</w:t>
+      </w:r>
+      <w:proofErr w:type="spellEnd"/>
+      <w:r>
+        <w:rPr>
+          <w:rFonts w:ascii="Times New Roman" w:hAnsi="Times New Roman" w:cs="Times New Roman"/>
+          <w:sz w:val="18"/>
+          <w:szCs w:val="18"/>
+        </w:rPr>
+        <w:t xml:space="preserve">-сетей и иных лиц, участвующих в исполнении операции и переводится на след № эл. кошелька </w:t>
+      </w:r>
+      <w:r>
+        <w:rPr>
+          <w:rFonts w:ascii="Times New Roman" w:hAnsi="Times New Roman" w:cs="Times New Roman"/>
+          <w:sz w:val="18"/>
+          <w:szCs w:val="18"/>
+        </w:rPr>
+        <w:t>${</w:t>
+      </w:r>
+      <w:proofErr w:type="spellStart"/>
+      <w:r>
+        <w:rPr>
+          <w:rFonts w:ascii="Times New Roman" w:hAnsi="Times New Roman" w:cs="Times New Roman"/>
+          <w:sz w:val="18"/>
+          <w:szCs w:val="18"/>
+        </w:rPr>
+        <w:t>paymentCustom.e_wallet</w:t>
+      </w:r>
+      <w:proofErr w:type="spellEnd"/>
+      <w:r>
+        <w:rPr>
+          <w:rFonts w:ascii="Times New Roman" w:hAnsi="Times New Roman" w:cs="Times New Roman"/>
+          <w:sz w:val="18"/>
+          <w:szCs w:val="18"/>
+        </w:rPr>
+        <w:t>}</w:t>
       </w:r>
       <w:r>
         <w:rPr>
@@ -368,7 +468,25 @@
           <w:sz w:val="18"/>
           <w:szCs w:val="18"/>
         </w:rPr>
-        <w:t>Клиент подтверждает, что понимает технические и правовые особенности операций с цифровой валютой, включая возможную необратимость операций, волатильность курса, зависимость исполнения от третьих лиц, банковских учреждений, бирж, обменных сервисов, блокчейн-сетей и иных инфраструктурных участников.</w:t>
+        <w:t xml:space="preserve">Клиент подтверждает, что понимает технические и правовые особенности операций с цифровой валютой, включая возможную необратимость операций, волатильность курса, зависимость исполнения от третьих лиц, банковских учреждений, бирж, обменных сервисов, </w:t>
+      </w:r>
+      <w:proofErr w:type="spellStart"/>
+      <w:r>
+        <w:rPr>
+          <w:rFonts w:ascii="Times New Roman" w:hAnsi="Times New Roman" w:cs="Times New Roman"/>
+          <w:sz w:val="18"/>
+          <w:szCs w:val="18"/>
+        </w:rPr>
+        <w:t>блокчейн</w:t>
+      </w:r>
+      <w:proofErr w:type="spellEnd"/>
+      <w:r>
+        <w:rPr>
+          <w:rFonts w:ascii="Times New Roman" w:hAnsi="Times New Roman" w:cs="Times New Roman"/>
+          <w:sz w:val="18"/>
+          <w:szCs w:val="18"/>
+        </w:rPr>
+        <w:t>-сетей и иных инфраструктурных участников.</w:t>
       </w:r>
     </w:p>
     <w:p>
@@ -608,7 +726,25 @@
                 <w:sz w:val="18"/>
                 <w:szCs w:val="18"/>
               </w:rPr>
-              <w:t>${customer.inn}</w:t>
+              <w:t>${</w:t>
+            </w:r>
+            <w:proofErr w:type="spellStart"/>
+            <w:r>
+              <w:rPr>
+                <w:rFonts w:ascii="Times New Roman" w:hAnsi="Times New Roman" w:cs="Times New Roman"/>
+                <w:sz w:val="18"/>
+                <w:szCs w:val="18"/>
+              </w:rPr>
+              <w:t>customer.inn</w:t>
+            </w:r>
+            <w:proofErr w:type="spellEnd"/>
+            <w:r>
+              <w:rPr>
+                <w:rFonts w:ascii="Times New Roman" w:hAnsi="Times New Roman" w:cs="Times New Roman"/>
+                <w:sz w:val="18"/>
+                <w:szCs w:val="18"/>
+              </w:rPr>
+              <w:t>}</w:t>
             </w:r>
           </w:p>
         </w:tc>
@@ -724,7 +860,41 @@
                 <w:szCs w:val="18"/>
                 <w:lang w:eastAsia="ru-RU"/>
               </w:rPr>
-              <w:t>${customer.ru.custom.pasport}</w:t>
+              <w:t>${</w:t>
+            </w:r>
+            <w:proofErr w:type="spellStart"/>
+            <w:proofErr w:type="gramStart"/>
+            <w:r>
+              <w:rPr>
+                <w:rFonts w:ascii="Times New Roman" w:eastAsia="Times New Roman" w:hAnsi="Times New Roman" w:cs="Times New Roman"/>
+                <w:bCs/>
+                <w:sz w:val="18"/>
+                <w:szCs w:val="18"/>
+                <w:lang w:eastAsia="ru-RU"/>
+              </w:rPr>
+              <w:t>customer.ru.custom</w:t>
+            </w:r>
+            <w:proofErr w:type="gramEnd"/>
+            <w:r>
+              <w:rPr>
+                <w:rFonts w:ascii="Times New Roman" w:eastAsia="Times New Roman" w:hAnsi="Times New Roman" w:cs="Times New Roman"/>
+                <w:bCs/>
+                <w:sz w:val="18"/>
+                <w:szCs w:val="18"/>
+                <w:lang w:eastAsia="ru-RU"/>
+              </w:rPr>
+              <w:t>.pasport</w:t>
+            </w:r>
+            <w:proofErr w:type="spellEnd"/>
+            <w:r>
+              <w:rPr>
+                <w:rFonts w:ascii="Times New Roman" w:eastAsia="Times New Roman" w:hAnsi="Times New Roman" w:cs="Times New Roman"/>
+                <w:bCs/>
+                <w:sz w:val="18"/>
+                <w:szCs w:val="18"/>
+                <w:lang w:eastAsia="ru-RU"/>
+              </w:rPr>
+              <w:t>}</w:t>
             </w:r>
           </w:p>
           <w:p>
@@ -796,7 +966,27 @@
                 <w:sz w:val="18"/>
                 <w:szCs w:val="18"/>
               </w:rPr>
-              <w:t>ОБЪЕДИНЕННЫЕ АРАБСКИЕ ЭМИРАТЫ, город Дубай,Международная свободная зона Дубая, Кремниевый оазис Дубая,</w:t>
+              <w:t xml:space="preserve">ОБЪЕДИНЕННЫЕ АРАБСКИЕ ЭМИРАТЫ, город </w:t>
+            </w:r>
+            <w:proofErr w:type="spellStart"/>
+            <w:proofErr w:type="gramStart"/>
+            <w:r>
+              <w:rPr>
+                <w:rFonts w:ascii="Times New Roman" w:hAnsi="Times New Roman" w:cs="Times New Roman"/>
+                <w:sz w:val="18"/>
+                <w:szCs w:val="18"/>
+              </w:rPr>
+              <w:t>Дубай,Международная</w:t>
+            </w:r>
+            <w:proofErr w:type="spellEnd"/>
+            <w:proofErr w:type="gramEnd"/>
+            <w:r>
+              <w:rPr>
+                <w:rFonts w:ascii="Times New Roman" w:hAnsi="Times New Roman" w:cs="Times New Roman"/>
+                <w:sz w:val="18"/>
+                <w:szCs w:val="18"/>
+              </w:rPr>
+              <w:t xml:space="preserve"> свободная зона Дубая, Кремниевый оазис Дубая,</w:t>
             </w:r>
             <w:r>
               <w:rPr>
@@ -933,7 +1123,47 @@
                 <w:szCs w:val="18"/>
                 <w:lang w:val="en-US"/>
               </w:rPr>
-              <w:t xml:space="preserve">${customer_account.payment_account}    </w:t>
+              <w:t>${</w:t>
+            </w:r>
+            <w:proofErr w:type="spellStart"/>
+            <w:r>
+              <w:rPr>
+                <w:rFonts w:ascii="Times New Roman" w:hAnsi="Times New Roman" w:cs="Times New Roman"/>
+                <w:sz w:val="18"/>
+                <w:szCs w:val="18"/>
+                <w:lang w:val="en-US"/>
+              </w:rPr>
+              <w:t>customer_</w:t>
+            </w:r>
+            <w:proofErr w:type="gramStart"/>
+            <w:r>
+              <w:rPr>
+                <w:rFonts w:ascii="Times New Roman" w:hAnsi="Times New Roman" w:cs="Times New Roman"/>
+                <w:sz w:val="18"/>
+                <w:szCs w:val="18"/>
+                <w:lang w:val="en-US"/>
+              </w:rPr>
+              <w:t>account.payment</w:t>
+            </w:r>
+            <w:proofErr w:type="gramEnd"/>
+            <w:r>
+              <w:rPr>
+                <w:rFonts w:ascii="Times New Roman" w:hAnsi="Times New Roman" w:cs="Times New Roman"/>
+                <w:sz w:val="18"/>
+                <w:szCs w:val="18"/>
+                <w:lang w:val="en-US"/>
+              </w:rPr>
+              <w:t>_account</w:t>
+            </w:r>
+            <w:proofErr w:type="spellEnd"/>
+            <w:r>
+              <w:rPr>
+                <w:rFonts w:ascii="Times New Roman" w:hAnsi="Times New Roman" w:cs="Times New Roman"/>
+                <w:sz w:val="18"/>
+                <w:szCs w:val="18"/>
+                <w:lang w:val="en-US"/>
+              </w:rPr>
+              <w:t xml:space="preserve">}    </w:t>
             </w:r>
           </w:p>
           <w:p>
@@ -1021,7 +1251,27 @@
                 <w:szCs w:val="18"/>
                 <w:lang w:val="en-US" w:eastAsia="ru-RU"/>
               </w:rPr>
-              <w:t>${customer_account.bic}</w:t>
+              <w:t>${</w:t>
+            </w:r>
+            <w:proofErr w:type="spellStart"/>
+            <w:r>
+              <w:rPr>
+                <w:rFonts w:ascii="Times New Roman" w:eastAsia="Times New Roman" w:hAnsi="Times New Roman" w:cs="Times New Roman"/>
+                <w:sz w:val="18"/>
+                <w:szCs w:val="18"/>
+                <w:lang w:val="en-US" w:eastAsia="ru-RU"/>
+              </w:rPr>
+              <w:t>customer_account.bic</w:t>
+            </w:r>
+            <w:proofErr w:type="spellEnd"/>
+            <w:r>
+              <w:rPr>
+                <w:rFonts w:ascii="Times New Roman" w:eastAsia="Times New Roman" w:hAnsi="Times New Roman" w:cs="Times New Roman"/>
+                <w:sz w:val="18"/>
+                <w:szCs w:val="18"/>
+                <w:lang w:val="en-US" w:eastAsia="ru-RU"/>
+              </w:rPr>
+              <w:t>}</w:t>
             </w:r>
           </w:p>
           <w:p>
@@ -1290,6 +1540,7 @@
                 <w:lang w:val="en-US" w:eastAsia="ru-RU"/>
               </w:rPr>
             </w:pPr>
+            <w:proofErr w:type="spellStart"/>
             <w:r>
               <w:rPr>
                 <w:rFonts w:ascii="Times New Roman" w:eastAsia="Times New Roman" w:hAnsi="Times New Roman" w:cs="Times New Roman"/>
@@ -1297,7 +1548,17 @@
                 <w:szCs w:val="18"/>
                 <w:lang w:val="en-US" w:eastAsia="ru-RU"/>
               </w:rPr>
-              <w:t>Валюта:</w:t>
+              <w:t>Валюта</w:t>
+            </w:r>
+            <w:proofErr w:type="spellEnd"/>
+            <w:r>
+              <w:rPr>
+                <w:rFonts w:ascii="Times New Roman" w:eastAsia="Times New Roman" w:hAnsi="Times New Roman" w:cs="Times New Roman"/>
+                <w:sz w:val="18"/>
+                <w:szCs w:val="18"/>
+                <w:lang w:val="en-US" w:eastAsia="ru-RU"/>
+              </w:rPr>
+              <w:t>:</w:t>
             </w:r>
             <w:r>
               <w:rPr>
@@ -1485,6 +1746,7 @@
                 <w:lang w:eastAsia="ru-RU"/>
               </w:rPr>
             </w:pPr>
+            <w:proofErr w:type="spellStart"/>
             <w:r>
               <w:rPr>
                 <w:rFonts w:ascii="Times New Roman" w:eastAsia="Times New Roman" w:hAnsi="Times New Roman" w:cs="Times New Roman"/>
@@ -1495,6 +1757,7 @@
               </w:rPr>
               <w:t>ед-цы</w:t>
             </w:r>
+            <w:proofErr w:type="spellEnd"/>
           </w:p>
         </w:tc>
         <w:tc>
@@ -1510,6 +1773,7 @@
                 <w:szCs w:val="18"/>
               </w:rPr>
             </w:pPr>
+            <w:proofErr w:type="spellStart"/>
             <w:r>
               <w:rPr>
                 <w:rFonts w:ascii="Times New Roman" w:eastAsia="Times New Roman" w:hAnsi="Times New Roman" w:cs="Times New Roman"/>
@@ -1518,8 +1782,31 @@
                 <w:szCs w:val="18"/>
                 <w:lang w:val="en-US" w:eastAsia="ru-RU"/>
               </w:rPr>
-              <w:t>Общая стоимость</w:t>
-            </w:r>
+              <w:t>Общая</w:t>
+            </w:r>
+            <w:proofErr w:type="spellEnd"/>
+            <w:r>
+              <w:rPr>
+                <w:rFonts w:ascii="Times New Roman" w:eastAsia="Times New Roman" w:hAnsi="Times New Roman" w:cs="Times New Roman"/>
+                <w:b/>
+                <w:sz w:val="18"/>
+                <w:szCs w:val="18"/>
+                <w:lang w:val="en-US" w:eastAsia="ru-RU"/>
+              </w:rPr>
+              <w:t xml:space="preserve"> </w:t>
+            </w:r>
+            <w:proofErr w:type="spellStart"/>
+            <w:r>
+              <w:rPr>
+                <w:rFonts w:ascii="Times New Roman" w:eastAsia="Times New Roman" w:hAnsi="Times New Roman" w:cs="Times New Roman"/>
+                <w:b/>
+                <w:sz w:val="18"/>
+                <w:szCs w:val="18"/>
+                <w:lang w:val="en-US" w:eastAsia="ru-RU"/>
+              </w:rPr>
+              <w:t>стоимость</w:t>
+            </w:r>
+            <w:proofErr w:type="spellEnd"/>
           </w:p>
         </w:tc>
       </w:tr>
@@ -1590,7 +1877,27 @@
                 <w:sz w:val="18"/>
                 <w:szCs w:val="18"/>
               </w:rPr>
-              <w:t xml:space="preserve">${payment.number} </w:t>
+              <w:t>${</w:t>
+            </w:r>
+            <w:proofErr w:type="spellStart"/>
+            <w:proofErr w:type="gramStart"/>
+            <w:r>
+              <w:rPr>
+                <w:rFonts w:ascii="Times New Roman" w:hAnsi="Times New Roman" w:cs="Times New Roman"/>
+                <w:sz w:val="18"/>
+                <w:szCs w:val="18"/>
+              </w:rPr>
+              <w:t>payment.number</w:t>
+            </w:r>
+            <w:proofErr w:type="spellEnd"/>
+            <w:proofErr w:type="gramEnd"/>
+            <w:r>
+              <w:rPr>
+                <w:rFonts w:ascii="Times New Roman" w:hAnsi="Times New Roman" w:cs="Times New Roman"/>
+                <w:sz w:val="18"/>
+                <w:szCs w:val="18"/>
+              </w:rPr>
+              <w:t xml:space="preserve">} </w:t>
             </w:r>
             <w:r>
               <w:rPr>
@@ -1608,7 +1915,25 @@
                 <w:sz w:val="18"/>
                 <w:szCs w:val="18"/>
               </w:rPr>
-              <w:t>${payment.date}</w:t>
+              <w:t>${</w:t>
+            </w:r>
+            <w:proofErr w:type="spellStart"/>
+            <w:r>
+              <w:rPr>
+                <w:rFonts w:ascii="Times New Roman" w:hAnsi="Times New Roman" w:cs="Times New Roman"/>
+                <w:sz w:val="18"/>
+                <w:szCs w:val="18"/>
+              </w:rPr>
+              <w:t>payment.date</w:t>
+            </w:r>
+            <w:proofErr w:type="spellEnd"/>
+            <w:r>
+              <w:rPr>
+                <w:rFonts w:ascii="Times New Roman" w:hAnsi="Times New Roman" w:cs="Times New Roman"/>
+                <w:sz w:val="18"/>
+                <w:szCs w:val="18"/>
+              </w:rPr>
+              <w:t>}</w:t>
             </w:r>
             <w:r>
               <w:rPr>
@@ -1653,7 +1978,27 @@
                 <w:szCs w:val="18"/>
                 <w:lang w:eastAsia="ru-RU"/>
               </w:rPr>
-              <w:t xml:space="preserve">${contract.number} </w:t>
+              <w:t>${</w:t>
+            </w:r>
+            <w:proofErr w:type="spellStart"/>
+            <w:r>
+              <w:rPr>
+                <w:rFonts w:ascii="Times New Roman" w:eastAsia="Times New Roman" w:hAnsi="Times New Roman" w:cs="Times New Roman"/>
+                <w:sz w:val="18"/>
+                <w:szCs w:val="18"/>
+                <w:lang w:eastAsia="ru-RU"/>
+              </w:rPr>
+              <w:t>contract.number</w:t>
+            </w:r>
+            <w:proofErr w:type="spellEnd"/>
+            <w:r>
+              <w:rPr>
+                <w:rFonts w:ascii="Times New Roman" w:eastAsia="Times New Roman" w:hAnsi="Times New Roman" w:cs="Times New Roman"/>
+                <w:sz w:val="18"/>
+                <w:szCs w:val="18"/>
+                <w:lang w:eastAsia="ru-RU"/>
+              </w:rPr>
+              <w:t xml:space="preserve">} </w:t>
             </w:r>
             <w:r>
               <w:rPr>
@@ -1680,7 +2025,27 @@
                 <w:szCs w:val="18"/>
                 <w:lang w:eastAsia="ru-RU"/>
               </w:rPr>
-              <w:t>${contract.date}</w:t>
+              <w:t>${</w:t>
+            </w:r>
+            <w:proofErr w:type="spellStart"/>
+            <w:r>
+              <w:rPr>
+                <w:rFonts w:ascii="Times New Roman" w:eastAsia="Times New Roman" w:hAnsi="Times New Roman" w:cs="Times New Roman"/>
+                <w:sz w:val="18"/>
+                <w:szCs w:val="18"/>
+                <w:lang w:eastAsia="ru-RU"/>
+              </w:rPr>
+              <w:t>contract.date</w:t>
+            </w:r>
+            <w:proofErr w:type="spellEnd"/>
+            <w:r>
+              <w:rPr>
+                <w:rFonts w:ascii="Times New Roman" w:eastAsia="Times New Roman" w:hAnsi="Times New Roman" w:cs="Times New Roman"/>
+                <w:sz w:val="18"/>
+                <w:szCs w:val="18"/>
+                <w:lang w:eastAsia="ru-RU"/>
+              </w:rPr>
+              <w:t>}</w:t>
             </w:r>
             <w:r>
               <w:rPr>
@@ -1738,8 +2103,9 @@
                 <w:szCs w:val="18"/>
                 <w:lang w:val="en-US"/>
               </w:rPr>
-              <w:t xml:space="preserve">${paymentCustom.supplier_payment_equal} </w:t>
-            </w:r>
+              <w:t>${</w:t>
+            </w:r>
+            <w:proofErr w:type="spellStart"/>
             <w:r>
               <w:rPr>
                 <w:rFonts w:ascii="Times New Roman" w:hAnsi="Times New Roman" w:cs="Times New Roman"/>
@@ -1748,8 +2114,41 @@
                 <w:szCs w:val="18"/>
                 <w:lang w:val="en-US"/>
               </w:rPr>
+              <w:t>paymentCustom.supplier_payment_</w:t>
+            </w:r>
+            <w:proofErr w:type="gramStart"/>
+            <w:r>
+              <w:rPr>
+                <w:rFonts w:ascii="Times New Roman" w:hAnsi="Times New Roman" w:cs="Times New Roman"/>
+                <w:color w:val="000000" w:themeColor="text1"/>
+                <w:sz w:val="18"/>
+                <w:szCs w:val="18"/>
+                <w:lang w:val="en-US"/>
+              </w:rPr>
+              <w:t>equal</w:t>
+            </w:r>
+            <w:proofErr w:type="spellEnd"/>
+            <w:r>
+              <w:rPr>
+                <w:rFonts w:ascii="Times New Roman" w:hAnsi="Times New Roman" w:cs="Times New Roman"/>
+                <w:color w:val="000000" w:themeColor="text1"/>
+                <w:sz w:val="18"/>
+                <w:szCs w:val="18"/>
+                <w:lang w:val="en-US"/>
+              </w:rPr>
+              <w:t xml:space="preserve">} </w:t>
+            </w:r>
+            <w:r>
+              <w:rPr>
+                <w:rFonts w:ascii="Times New Roman" w:hAnsi="Times New Roman" w:cs="Times New Roman"/>
+                <w:color w:val="000000" w:themeColor="text1"/>
+                <w:sz w:val="18"/>
+                <w:szCs w:val="18"/>
+                <w:lang w:val="en-US"/>
+              </w:rPr>
               <w:t xml:space="preserve"> </w:t>
             </w:r>
+            <w:proofErr w:type="spellStart"/>
             <w:r>
               <w:rPr>
                 <w:rFonts w:ascii="Times New Roman" w:eastAsia="Times New Roman" w:hAnsi="Times New Roman" w:cs="Times New Roman"/>
@@ -1759,6 +2158,7 @@
               </w:rPr>
               <w:t>руб</w:t>
             </w:r>
+            <w:proofErr w:type="spellEnd"/>
             <w:r>
               <w:rPr>
                 <w:rFonts w:ascii="Times New Roman" w:eastAsia="Times New Roman" w:hAnsi="Times New Roman" w:cs="Times New Roman"/>
@@ -1768,6 +2168,7 @@
               </w:rPr>
               <w:t>.</w:t>
             </w:r>
+            <w:proofErr w:type="gramEnd"/>
           </w:p>
         </w:tc>
         <w:tc>
@@ -1791,8 +2192,9 @@
                 <w:szCs w:val="18"/>
                 <w:lang w:val="en-US"/>
               </w:rPr>
-              <w:t xml:space="preserve">${paymentCustom.supplier_payment_equal} </w:t>
-            </w:r>
+              <w:t>${</w:t>
+            </w:r>
+            <w:proofErr w:type="spellStart"/>
             <w:r>
               <w:rPr>
                 <w:rFonts w:ascii="Times New Roman" w:hAnsi="Times New Roman" w:cs="Times New Roman"/>
@@ -1801,8 +2203,41 @@
                 <w:szCs w:val="18"/>
                 <w:lang w:val="en-US"/>
               </w:rPr>
+              <w:t>paymentCustom.supplier_payment_</w:t>
+            </w:r>
+            <w:proofErr w:type="gramStart"/>
+            <w:r>
+              <w:rPr>
+                <w:rFonts w:ascii="Times New Roman" w:hAnsi="Times New Roman" w:cs="Times New Roman"/>
+                <w:color w:val="000000" w:themeColor="text1"/>
+                <w:sz w:val="18"/>
+                <w:szCs w:val="18"/>
+                <w:lang w:val="en-US"/>
+              </w:rPr>
+              <w:t>equal</w:t>
+            </w:r>
+            <w:proofErr w:type="spellEnd"/>
+            <w:r>
+              <w:rPr>
+                <w:rFonts w:ascii="Times New Roman" w:hAnsi="Times New Roman" w:cs="Times New Roman"/>
+                <w:color w:val="000000" w:themeColor="text1"/>
+                <w:sz w:val="18"/>
+                <w:szCs w:val="18"/>
+                <w:lang w:val="en-US"/>
+              </w:rPr>
+              <w:t xml:space="preserve">} </w:t>
+            </w:r>
+            <w:r>
+              <w:rPr>
+                <w:rFonts w:ascii="Times New Roman" w:hAnsi="Times New Roman" w:cs="Times New Roman"/>
+                <w:color w:val="000000" w:themeColor="text1"/>
+                <w:sz w:val="18"/>
+                <w:szCs w:val="18"/>
+                <w:lang w:val="en-US"/>
+              </w:rPr>
               <w:t xml:space="preserve"> </w:t>
             </w:r>
+            <w:proofErr w:type="spellStart"/>
             <w:r>
               <w:rPr>
                 <w:rFonts w:ascii="Times New Roman" w:eastAsia="Times New Roman" w:hAnsi="Times New Roman" w:cs="Times New Roman"/>
@@ -1812,6 +2247,7 @@
               </w:rPr>
               <w:t>руб</w:t>
             </w:r>
+            <w:proofErr w:type="spellEnd"/>
             <w:r>
               <w:rPr>
                 <w:rFonts w:ascii="Times New Roman" w:eastAsia="Times New Roman" w:hAnsi="Times New Roman" w:cs="Times New Roman"/>
@@ -1821,6 +2257,7 @@
               </w:rPr>
               <w:t>.</w:t>
             </w:r>
+            <w:proofErr w:type="gramEnd"/>
           </w:p>
         </w:tc>
       </w:tr>
@@ -1889,7 +2326,27 @@
                 <w:sz w:val="18"/>
                 <w:szCs w:val="18"/>
               </w:rPr>
-              <w:t>${payment.number}</w:t>
+              <w:t>${</w:t>
+            </w:r>
+            <w:proofErr w:type="spellStart"/>
+            <w:proofErr w:type="gramStart"/>
+            <w:r>
+              <w:rPr>
+                <w:rFonts w:ascii="Times New Roman" w:hAnsi="Times New Roman" w:cs="Times New Roman"/>
+                <w:sz w:val="18"/>
+                <w:szCs w:val="18"/>
+              </w:rPr>
+              <w:t>payment.number</w:t>
+            </w:r>
+            <w:proofErr w:type="spellEnd"/>
+            <w:proofErr w:type="gramEnd"/>
+            <w:r>
+              <w:rPr>
+                <w:rFonts w:ascii="Times New Roman" w:hAnsi="Times New Roman" w:cs="Times New Roman"/>
+                <w:sz w:val="18"/>
+                <w:szCs w:val="18"/>
+              </w:rPr>
+              <w:t>}</w:t>
             </w:r>
             <w:r>
               <w:rPr>
@@ -1919,8 +2376,9 @@
                 <w:szCs w:val="18"/>
                 <w:lang w:eastAsia="ru-RU"/>
               </w:rPr>
-              <w:t>${payment.date}_</w:t>
-            </w:r>
+              <w:t>${</w:t>
+            </w:r>
+            <w:proofErr w:type="spellStart"/>
             <w:r>
               <w:rPr>
                 <w:rFonts w:ascii="Times New Roman" w:eastAsia="Times New Roman" w:hAnsi="Times New Roman" w:cs="Times New Roman"/>
@@ -1929,6 +2387,28 @@
                 <w:szCs w:val="18"/>
                 <w:lang w:eastAsia="ru-RU"/>
               </w:rPr>
+              <w:t>payment.date</w:t>
+            </w:r>
+            <w:proofErr w:type="spellEnd"/>
+            <w:r>
+              <w:rPr>
+                <w:rFonts w:ascii="Times New Roman" w:eastAsia="Times New Roman" w:hAnsi="Times New Roman" w:cs="Times New Roman"/>
+                <w:color w:val="000000"/>
+                <w:sz w:val="18"/>
+                <w:szCs w:val="18"/>
+                <w:lang w:eastAsia="ru-RU"/>
+              </w:rPr>
+              <w:t>}_</w:t>
+            </w:r>
+            <w:proofErr w:type="spellStart"/>
+            <w:r>
+              <w:rPr>
+                <w:rFonts w:ascii="Times New Roman" w:eastAsia="Times New Roman" w:hAnsi="Times New Roman" w:cs="Times New Roman"/>
+                <w:color w:val="000000"/>
+                <w:sz w:val="18"/>
+                <w:szCs w:val="18"/>
+                <w:lang w:eastAsia="ru-RU"/>
+              </w:rPr>
               <w:t>г.</w:t>
             </w:r>
             <w:r>
@@ -1949,7 +2429,18 @@
                 <w:szCs w:val="18"/>
                 <w:lang w:eastAsia="ru-RU"/>
               </w:rPr>
-              <w:t xml:space="preserve">по </w:t>
+              <w:t>по</w:t>
+            </w:r>
+            <w:proofErr w:type="spellEnd"/>
+            <w:r>
+              <w:rPr>
+                <w:rFonts w:ascii="Times New Roman" w:eastAsia="Times New Roman" w:hAnsi="Times New Roman" w:cs="Times New Roman"/>
+                <w:color w:val="000000"/>
+                <w:sz w:val="18"/>
+                <w:szCs w:val="18"/>
+                <w:lang w:eastAsia="ru-RU"/>
+              </w:rPr>
+              <w:t xml:space="preserve"> </w:t>
             </w:r>
             <w:r>
               <w:rPr>
@@ -1995,7 +2486,27 @@
                 <w:szCs w:val="18"/>
                 <w:lang w:eastAsia="ru-RU"/>
               </w:rPr>
-              <w:t>${contract.number}</w:t>
+              <w:t>${</w:t>
+            </w:r>
+            <w:proofErr w:type="spellStart"/>
+            <w:r>
+              <w:rPr>
+                <w:rFonts w:ascii="Times New Roman" w:eastAsia="Times New Roman" w:hAnsi="Times New Roman" w:cs="Times New Roman"/>
+                <w:sz w:val="18"/>
+                <w:szCs w:val="18"/>
+                <w:lang w:eastAsia="ru-RU"/>
+              </w:rPr>
+              <w:t>contract.number</w:t>
+            </w:r>
+            <w:proofErr w:type="spellEnd"/>
+            <w:r>
+              <w:rPr>
+                <w:rFonts w:ascii="Times New Roman" w:eastAsia="Times New Roman" w:hAnsi="Times New Roman" w:cs="Times New Roman"/>
+                <w:sz w:val="18"/>
+                <w:szCs w:val="18"/>
+                <w:lang w:eastAsia="ru-RU"/>
+              </w:rPr>
+              <w:t>}</w:t>
             </w:r>
             <w:r>
               <w:rPr>
@@ -2022,7 +2533,27 @@
                 <w:szCs w:val="18"/>
                 <w:lang w:eastAsia="ru-RU"/>
               </w:rPr>
-              <w:t>${contract.date}</w:t>
+              <w:t>${</w:t>
+            </w:r>
+            <w:proofErr w:type="spellStart"/>
+            <w:r>
+              <w:rPr>
+                <w:rFonts w:ascii="Times New Roman" w:eastAsia="Times New Roman" w:hAnsi="Times New Roman" w:cs="Times New Roman"/>
+                <w:sz w:val="18"/>
+                <w:szCs w:val="18"/>
+                <w:lang w:eastAsia="ru-RU"/>
+              </w:rPr>
+              <w:t>contract.date</w:t>
+            </w:r>
+            <w:proofErr w:type="spellEnd"/>
+            <w:r>
+              <w:rPr>
+                <w:rFonts w:ascii="Times New Roman" w:eastAsia="Times New Roman" w:hAnsi="Times New Roman" w:cs="Times New Roman"/>
+                <w:sz w:val="18"/>
+                <w:szCs w:val="18"/>
+                <w:lang w:eastAsia="ru-RU"/>
+              </w:rPr>
+              <w:t>}</w:t>
             </w:r>
           </w:p>
         </w:tc>
@@ -2070,8 +2601,9 @@
                 <w:szCs w:val="18"/>
                 <w:lang w:val="en-US" w:eastAsia="ru-RU"/>
               </w:rPr>
-              <w:t xml:space="preserve">${paymentCustom.agent_fee_amount} </w:t>
-            </w:r>
+              <w:t>${</w:t>
+            </w:r>
+            <w:proofErr w:type="spellStart"/>
             <w:r>
               <w:rPr>
                 <w:rFonts w:ascii="Times New Roman" w:eastAsia="Times New Roman" w:hAnsi="Times New Roman" w:cs="Times New Roman"/>
@@ -2079,8 +2611,38 @@
                 <w:szCs w:val="18"/>
                 <w:lang w:val="en-US" w:eastAsia="ru-RU"/>
               </w:rPr>
+              <w:t>paymentCustom.agent_fee_</w:t>
+            </w:r>
+            <w:proofErr w:type="gramStart"/>
+            <w:r>
+              <w:rPr>
+                <w:rFonts w:ascii="Times New Roman" w:eastAsia="Times New Roman" w:hAnsi="Times New Roman" w:cs="Times New Roman"/>
+                <w:sz w:val="18"/>
+                <w:szCs w:val="18"/>
+                <w:lang w:val="en-US" w:eastAsia="ru-RU"/>
+              </w:rPr>
+              <w:t>amount</w:t>
+            </w:r>
+            <w:proofErr w:type="spellEnd"/>
+            <w:r>
+              <w:rPr>
+                <w:rFonts w:ascii="Times New Roman" w:eastAsia="Times New Roman" w:hAnsi="Times New Roman" w:cs="Times New Roman"/>
+                <w:sz w:val="18"/>
+                <w:szCs w:val="18"/>
+                <w:lang w:val="en-US" w:eastAsia="ru-RU"/>
+              </w:rPr>
+              <w:t xml:space="preserve">} </w:t>
+            </w:r>
+            <w:r>
+              <w:rPr>
+                <w:rFonts w:ascii="Times New Roman" w:eastAsia="Times New Roman" w:hAnsi="Times New Roman" w:cs="Times New Roman"/>
+                <w:sz w:val="18"/>
+                <w:szCs w:val="18"/>
+                <w:lang w:val="en-US" w:eastAsia="ru-RU"/>
+              </w:rPr>
               <w:t xml:space="preserve"> </w:t>
             </w:r>
+            <w:proofErr w:type="spellStart"/>
             <w:r>
               <w:rPr>
                 <w:rFonts w:ascii="Times New Roman" w:eastAsia="Times New Roman" w:hAnsi="Times New Roman" w:cs="Times New Roman"/>
@@ -2090,6 +2652,7 @@
               </w:rPr>
               <w:t>руб</w:t>
             </w:r>
+            <w:proofErr w:type="spellEnd"/>
             <w:r>
               <w:rPr>
                 <w:rFonts w:ascii="Times New Roman" w:eastAsia="Times New Roman" w:hAnsi="Times New Roman" w:cs="Times New Roman"/>
@@ -2099,6 +2662,7 @@
               </w:rPr>
               <w:t>.</w:t>
             </w:r>
+            <w:proofErr w:type="gramEnd"/>
           </w:p>
         </w:tc>
         <w:tc>
@@ -2121,8 +2685,9 @@
                 <w:szCs w:val="18"/>
                 <w:lang w:val="en-US" w:eastAsia="ru-RU"/>
               </w:rPr>
-              <w:t xml:space="preserve">${paymentCustom.agent_fee_amount} </w:t>
-            </w:r>
+              <w:t>${</w:t>
+            </w:r>
+            <w:proofErr w:type="spellStart"/>
             <w:r>
               <w:rPr>
                 <w:rFonts w:ascii="Times New Roman" w:eastAsia="Times New Roman" w:hAnsi="Times New Roman" w:cs="Times New Roman"/>
@@ -2130,8 +2695,38 @@
                 <w:szCs w:val="18"/>
                 <w:lang w:val="en-US" w:eastAsia="ru-RU"/>
               </w:rPr>
+              <w:t>paymentCustom.agent_fee_</w:t>
+            </w:r>
+            <w:proofErr w:type="gramStart"/>
+            <w:r>
+              <w:rPr>
+                <w:rFonts w:ascii="Times New Roman" w:eastAsia="Times New Roman" w:hAnsi="Times New Roman" w:cs="Times New Roman"/>
+                <w:sz w:val="18"/>
+                <w:szCs w:val="18"/>
+                <w:lang w:val="en-US" w:eastAsia="ru-RU"/>
+              </w:rPr>
+              <w:t>amount</w:t>
+            </w:r>
+            <w:proofErr w:type="spellEnd"/>
+            <w:r>
+              <w:rPr>
+                <w:rFonts w:ascii="Times New Roman" w:eastAsia="Times New Roman" w:hAnsi="Times New Roman" w:cs="Times New Roman"/>
+                <w:sz w:val="18"/>
+                <w:szCs w:val="18"/>
+                <w:lang w:val="en-US" w:eastAsia="ru-RU"/>
+              </w:rPr>
+              <w:t xml:space="preserve">} </w:t>
+            </w:r>
+            <w:r>
+              <w:rPr>
+                <w:rFonts w:ascii="Times New Roman" w:eastAsia="Times New Roman" w:hAnsi="Times New Roman" w:cs="Times New Roman"/>
+                <w:sz w:val="18"/>
+                <w:szCs w:val="18"/>
+                <w:lang w:val="en-US" w:eastAsia="ru-RU"/>
+              </w:rPr>
               <w:t xml:space="preserve"> </w:t>
             </w:r>
+            <w:proofErr w:type="spellStart"/>
             <w:r>
               <w:rPr>
                 <w:rFonts w:ascii="Times New Roman" w:eastAsia="Times New Roman" w:hAnsi="Times New Roman" w:cs="Times New Roman"/>
@@ -2141,6 +2736,7 @@
               </w:rPr>
               <w:t>руб</w:t>
             </w:r>
+            <w:proofErr w:type="spellEnd"/>
             <w:r>
               <w:rPr>
                 <w:rFonts w:ascii="Times New Roman" w:eastAsia="Times New Roman" w:hAnsi="Times New Roman" w:cs="Times New Roman"/>
@@ -2150,6 +2746,7 @@
               </w:rPr>
               <w:t>.</w:t>
             </w:r>
+            <w:proofErr w:type="gramEnd"/>
           </w:p>
         </w:tc>
       </w:tr>
@@ -2363,8 +2960,9 @@
                 <w:szCs w:val="18"/>
                 <w:lang w:val="en-US" w:eastAsia="ru-RU"/>
               </w:rPr>
-              <w:t xml:space="preserve">${paymentCustom.full_payment_amount} </w:t>
-            </w:r>
+              <w:t>${</w:t>
+            </w:r>
+            <w:proofErr w:type="spellStart"/>
             <w:r>
               <w:rPr>
                 <w:rFonts w:ascii="Times New Roman" w:eastAsia="Times New Roman" w:hAnsi="Times New Roman" w:cs="Times New Roman"/>
@@ -2374,6 +2972,41 @@
                 <w:szCs w:val="18"/>
                 <w:lang w:val="en-US" w:eastAsia="ru-RU"/>
               </w:rPr>
+              <w:t>paymentCustom.full_payment_</w:t>
+            </w:r>
+            <w:proofErr w:type="gramStart"/>
+            <w:r>
+              <w:rPr>
+                <w:rFonts w:ascii="Times New Roman" w:eastAsia="Times New Roman" w:hAnsi="Times New Roman" w:cs="Times New Roman"/>
+                <w:b/>
+                <w:bCs/>
+                <w:sz w:val="18"/>
+                <w:szCs w:val="18"/>
+                <w:lang w:val="en-US" w:eastAsia="ru-RU"/>
+              </w:rPr>
+              <w:t>amount</w:t>
+            </w:r>
+            <w:proofErr w:type="spellEnd"/>
+            <w:r>
+              <w:rPr>
+                <w:rFonts w:ascii="Times New Roman" w:eastAsia="Times New Roman" w:hAnsi="Times New Roman" w:cs="Times New Roman"/>
+                <w:b/>
+                <w:bCs/>
+                <w:sz w:val="18"/>
+                <w:szCs w:val="18"/>
+                <w:lang w:val="en-US" w:eastAsia="ru-RU"/>
+              </w:rPr>
+              <w:t xml:space="preserve">} </w:t>
+            </w:r>
+            <w:r>
+              <w:rPr>
+                <w:rFonts w:ascii="Times New Roman" w:eastAsia="Times New Roman" w:hAnsi="Times New Roman" w:cs="Times New Roman"/>
+                <w:b/>
+                <w:bCs/>
+                <w:sz w:val="18"/>
+                <w:szCs w:val="18"/>
+                <w:lang w:val="en-US" w:eastAsia="ru-RU"/>
+              </w:rPr>
               <w:t xml:space="preserve"> </w:t>
             </w:r>
             <w:r>
@@ -2384,7 +3017,18 @@
                 <w:szCs w:val="18"/>
                 <w:lang w:val="en-US" w:eastAsia="ru-RU"/>
               </w:rPr>
-              <w:t>RUB.</w:t>
+              <w:t>RUB</w:t>
+            </w:r>
+            <w:proofErr w:type="gramEnd"/>
+            <w:r>
+              <w:rPr>
+                <w:rFonts w:ascii="Times New Roman" w:eastAsia="Times New Roman" w:hAnsi="Times New Roman" w:cs="Times New Roman"/>
+                <w:b/>
+                <w:sz w:val="18"/>
+                <w:szCs w:val="18"/>
+                <w:lang w:val="en-US" w:eastAsia="ru-RU"/>
+              </w:rPr>
+              <w:t>.</w:t>
             </w:r>
           </w:p>
         </w:tc>
@@ -2411,13 +3055,88 @@
           <w:szCs w:val="18"/>
         </w:rPr>
         <w:drawing>
-          <wp:anchor distT="0" distB="0" distL="114300" distR="114300" simplePos="0" relativeHeight="251659264" behindDoc="0" locked="0" layoutInCell="1" allowOverlap="1" wp14:anchorId="535BF9EA" wp14:editId="78583F0B">
+          <wp:anchor distT="0" distB="0" distL="114300" distR="114300" simplePos="0" relativeHeight="251660288" behindDoc="1" locked="0" layoutInCell="1" allowOverlap="1" wp14:anchorId="396858FD" wp14:editId="3009D59D">
             <wp:simplePos x="0" y="0"/>
             <wp:positionH relativeFrom="column">
-              <wp:posOffset>-718185</wp:posOffset>
+              <wp:posOffset>995045</wp:posOffset>
             </wp:positionH>
             <wp:positionV relativeFrom="paragraph">
-              <wp:posOffset>142240</wp:posOffset>
+              <wp:posOffset>6129</wp:posOffset>
+            </wp:positionV>
+            <wp:extent cx="1081378" cy="1081378"/>
+            <wp:effectExtent l="0" t="0" r="5080" b="5080"/>
+            <wp:wrapNone/>
+            <wp:docPr id="10" name="Рисунок 10"/>
+            <wp:cNvGraphicFramePr>
+              <a:graphicFrameLocks xmlns:a="http://schemas.openxmlformats.org/drawingml/2006/main" noChangeAspect="1"/>
+            </wp:cNvGraphicFramePr>
+            <a:graphic xmlns:a="http://schemas.openxmlformats.org/drawingml/2006/main">
+              <a:graphicData uri="http://schemas.openxmlformats.org/drawingml/2006/picture">
+                <pic:pic xmlns:pic="http://schemas.openxmlformats.org/drawingml/2006/picture">
+                  <pic:nvPicPr>
+                    <pic:cNvPr id="10" name="Рисунок 10"/>
+                    <pic:cNvPicPr/>
+                  </pic:nvPicPr>
+                  <pic:blipFill>
+                    <a:blip r:embed="rId8" cstate="print">
+                      <a:extLst>
+                        <a:ext uri="{28A0092B-C50C-407E-A947-70E740481C1C}">
+                          <a14:useLocalDpi xmlns:a14="http://schemas.microsoft.com/office/drawing/2010/main" val="0"/>
+                        </a:ext>
+                      </a:extLst>
+                    </a:blip>
+                    <a:stretch>
+                      <a:fillRect/>
+                    </a:stretch>
+                  </pic:blipFill>
+                  <pic:spPr>
+                    <a:xfrm>
+                      <a:off x="0" y="0"/>
+                      <a:ext cx="1081378" cy="1081378"/>
+                    </a:xfrm>
+                    <a:prstGeom prst="rect">
+                      <a:avLst/>
+                    </a:prstGeom>
+                  </pic:spPr>
+                </pic:pic>
+              </a:graphicData>
+            </a:graphic>
+            <wp14:sizeRelH relativeFrom="page">
+              <wp14:pctWidth>0</wp14:pctWidth>
+            </wp14:sizeRelH>
+            <wp14:sizeRelV relativeFrom="page">
+              <wp14:pctHeight>0</wp14:pctHeight>
+            </wp14:sizeRelV>
+          </wp:anchor>
+        </w:drawing>
+      </w:r>
+    </w:p>
+    <w:p>
+      <w:pPr>
+        <w:ind w:left="-1134"/>
+        <w:rPr>
+          <w:rFonts w:ascii="Times New Roman" w:hAnsi="Times New Roman" w:cs="Times New Roman"/>
+          <w:sz w:val="18"/>
+          <w:szCs w:val="18"/>
+        </w:rPr>
+      </w:pPr>
+      <w:r>
+        <w:rPr>
+          <w:rFonts w:ascii="Times New Roman" w:hAnsi="Times New Roman" w:cs="Times New Roman"/>
+          <w:b/>
+          <w:bCs/>
+          <w:noProof/>
+          <w:sz w:val="18"/>
+          <w:szCs w:val="18"/>
+        </w:rPr>
+        <w:drawing>
+          <wp:anchor distT="0" distB="0" distL="114300" distR="114300" simplePos="0" relativeHeight="251659264" behindDoc="0" locked="0" layoutInCell="1" allowOverlap="1" wp14:anchorId="535BF9EA" wp14:editId="6CA7C8D8">
+            <wp:simplePos x="0" y="0"/>
+            <wp:positionH relativeFrom="column">
+              <wp:posOffset>-641985</wp:posOffset>
+            </wp:positionH>
+            <wp:positionV relativeFrom="paragraph">
+              <wp:posOffset>140335</wp:posOffset>
             </wp:positionV>
             <wp:extent cx="1980482" cy="753466"/>
             <wp:effectExtent l="0" t="0" r="0" b="0"/>
@@ -2434,7 +3153,7 @@
                     <pic:cNvPicPr/>
                   </pic:nvPicPr>
                   <pic:blipFill>
-                    <a:blip r:embed="rId8" cstate="print">
+                    <a:blip r:embed="rId9" cstate="print">
                       <a:extLst>
                         <a:ext uri="{28A0092B-C50C-407E-A947-70E740481C1C}">
                           <a14:useLocalDpi xmlns:a14="http://schemas.microsoft.com/office/drawing/2010/main" val="0"/>
@@ -2469,87 +3188,34 @@
       <w:r>
         <w:rPr>
           <w:rFonts w:ascii="Times New Roman" w:hAnsi="Times New Roman" w:cs="Times New Roman"/>
-          <w:b/>
-          <w:bCs/>
-          <w:noProof/>
-          <w:sz w:val="18"/>
-          <w:szCs w:val="18"/>
-        </w:rPr>
-        <w:drawing>
-          <wp:anchor distT="0" distB="0" distL="114300" distR="114300" simplePos="0" relativeHeight="251660288" behindDoc="1" locked="0" layoutInCell="1" allowOverlap="1" wp14:anchorId="396858FD" wp14:editId="3AC5C73C">
-            <wp:simplePos x="0" y="0"/>
-            <wp:positionH relativeFrom="column">
-              <wp:posOffset>995045</wp:posOffset>
-            </wp:positionH>
-            <wp:positionV relativeFrom="paragraph">
-              <wp:posOffset>6129</wp:posOffset>
-            </wp:positionV>
-            <wp:extent cx="1081378" cy="1081378"/>
-            <wp:effectExtent l="0" t="0" r="5080" b="5080"/>
-            <wp:wrapNone/>
-            <wp:docPr id="10" name="Рисунок 10"/>
-            <wp:cNvGraphicFramePr>
-              <a:graphicFrameLocks xmlns:a="http://schemas.openxmlformats.org/drawingml/2006/main" noChangeAspect="1"/>
-            </wp:cNvGraphicFramePr>
-            <a:graphic xmlns:a="http://schemas.openxmlformats.org/drawingml/2006/main">
-              <a:graphicData uri="http://schemas.openxmlformats.org/drawingml/2006/picture">
-                <pic:pic xmlns:pic="http://schemas.openxmlformats.org/drawingml/2006/picture">
-                  <pic:nvPicPr>
-                    <pic:cNvPr id="10" name="Рисунок 10"/>
-                    <pic:cNvPicPr/>
-                  </pic:nvPicPr>
-                  <pic:blipFill>
-                    <a:blip r:embed="rId9" cstate="print">
-                      <a:extLst>
-                        <a:ext uri="{28A0092B-C50C-407E-A947-70E740481C1C}">
-                          <a14:useLocalDpi xmlns:a14="http://schemas.microsoft.com/office/drawing/2010/main" val="0"/>
-                        </a:ext>
-                      </a:extLst>
-                    </a:blip>
-                    <a:stretch>
-                      <a:fillRect/>
-                    </a:stretch>
-                  </pic:blipFill>
-                  <pic:spPr>
-                    <a:xfrm>
-                      <a:off x="0" y="0"/>
-                      <a:ext cx="1081378" cy="1081378"/>
-                    </a:xfrm>
-                    <a:prstGeom prst="rect">
-                      <a:avLst/>
-                    </a:prstGeom>
-                  </pic:spPr>
-                </pic:pic>
-              </a:graphicData>
-            </a:graphic>
-            <wp14:sizeRelH relativeFrom="page">
-              <wp14:pctWidth>0</wp14:pctWidth>
-            </wp14:sizeRelH>
-            <wp14:sizeRelV relativeFrom="page">
-              <wp14:pctHeight>0</wp14:pctHeight>
-            </wp14:sizeRelV>
-          </wp:anchor>
-        </w:drawing>
-      </w:r>
-    </w:p>
-    <w:p>
-      <w:pPr>
-        <w:ind w:left="-1134"/>
-        <w:rPr>
-          <w:rFonts w:ascii="Times New Roman" w:hAnsi="Times New Roman" w:cs="Times New Roman"/>
-          <w:sz w:val="18"/>
-          <w:szCs w:val="18"/>
-        </w:rPr>
-      </w:pPr>
-      <w:r>
-        <w:rPr>
-          <w:rFonts w:ascii="Times New Roman" w:hAnsi="Times New Roman" w:cs="Times New Roman"/>
           <w:color w:val="000000"/>
           <w:kern w:val="28"/>
           <w:sz w:val="18"/>
           <w:szCs w:val="18"/>
         </w:rPr>
-        <w:t>ФИО: Салеев Ярослав Станиславович</w:t>
+        <w:t xml:space="preserve">ФИО: </w:t>
+      </w:r>
+      <w:proofErr w:type="spellStart"/>
+      <w:r>
+        <w:rPr>
+          <w:rFonts w:ascii="Times New Roman" w:hAnsi="Times New Roman" w:cs="Times New Roman"/>
+          <w:color w:val="000000"/>
+          <w:kern w:val="28"/>
+          <w:sz w:val="18"/>
+          <w:szCs w:val="18"/>
+        </w:rPr>
+        <w:t>Салеев</w:t>
+      </w:r>
+      <w:proofErr w:type="spellEnd"/>
+      <w:r>
+        <w:rPr>
+          <w:rFonts w:ascii="Times New Roman" w:hAnsi="Times New Roman" w:cs="Times New Roman"/>
+          <w:color w:val="000000"/>
+          <w:kern w:val="28"/>
+          <w:sz w:val="18"/>
+          <w:szCs w:val="18"/>
+        </w:rPr>
+        <w:t xml:space="preserve"> Ярослав Станиславович</w:t>
       </w:r>
     </w:p>
     <w:p>
@@ -3428,7 +4094,35 @@
           <w:sz w:val="18"/>
           <w:szCs w:val="18"/>
         </w:rPr>
-        <w:t xml:space="preserve">${customer.ru.custom.date_of_completion} </w:t>
+        <w:t>${</w:t>
+      </w:r>
+      <w:proofErr w:type="spellStart"/>
+      <w:proofErr w:type="gramStart"/>
+      <w:r>
+        <w:rPr>
+          <w:rFonts w:ascii="Times New Roman" w:hAnsi="Times New Roman" w:cs="Times New Roman"/>
+          <w:sz w:val="18"/>
+          <w:szCs w:val="18"/>
+        </w:rPr>
+        <w:t>customer.ru.custom</w:t>
+      </w:r>
+      <w:proofErr w:type="gramEnd"/>
+      <w:r>
+        <w:rPr>
+          <w:rFonts w:ascii="Times New Roman" w:hAnsi="Times New Roman" w:cs="Times New Roman"/>
+          <w:sz w:val="18"/>
+          <w:szCs w:val="18"/>
+        </w:rPr>
+        <w:t>.date_of_completion</w:t>
+      </w:r>
+      <w:proofErr w:type="spellEnd"/>
+      <w:r>
+        <w:rPr>
+          <w:rFonts w:ascii="Times New Roman" w:hAnsi="Times New Roman" w:cs="Times New Roman"/>
+          <w:sz w:val="18"/>
+          <w:szCs w:val="18"/>
+        </w:rPr>
+        <w:t xml:space="preserve">} </w:t>
       </w:r>
       <w:r>
         <w:rPr>
@@ -3641,7 +4335,27 @@
           <w:sz w:val="18"/>
           <w:szCs w:val="18"/>
         </w:rPr>
-        <w:t xml:space="preserve">${payment.number} </w:t>
+        <w:t>${</w:t>
+      </w:r>
+      <w:proofErr w:type="spellStart"/>
+      <w:proofErr w:type="gramStart"/>
+      <w:r>
+        <w:rPr>
+          <w:rFonts w:ascii="Times New Roman" w:hAnsi="Times New Roman" w:cs="Times New Roman"/>
+          <w:sz w:val="18"/>
+          <w:szCs w:val="18"/>
+        </w:rPr>
+        <w:t>payment.number</w:t>
+      </w:r>
+      <w:proofErr w:type="spellEnd"/>
+      <w:proofErr w:type="gramEnd"/>
+      <w:r>
+        <w:rPr>
+          <w:rFonts w:ascii="Times New Roman" w:hAnsi="Times New Roman" w:cs="Times New Roman"/>
+          <w:sz w:val="18"/>
+          <w:szCs w:val="18"/>
+        </w:rPr>
+        <w:t xml:space="preserve">} </w:t>
       </w:r>
       <w:r>
         <w:rPr>
@@ -3657,7 +4371,25 @@
           <w:sz w:val="18"/>
           <w:szCs w:val="18"/>
         </w:rPr>
-        <w:t>${payment.date}</w:t>
+        <w:t>${</w:t>
+      </w:r>
+      <w:proofErr w:type="spellStart"/>
+      <w:r>
+        <w:rPr>
+          <w:rFonts w:ascii="Times New Roman" w:hAnsi="Times New Roman" w:cs="Times New Roman"/>
+          <w:sz w:val="18"/>
+          <w:szCs w:val="18"/>
+        </w:rPr>
+        <w:t>payment.date</w:t>
+      </w:r>
+      <w:proofErr w:type="spellEnd"/>
+      <w:r>
+        <w:rPr>
+          <w:rFonts w:ascii="Times New Roman" w:hAnsi="Times New Roman" w:cs="Times New Roman"/>
+          <w:sz w:val="18"/>
+          <w:szCs w:val="18"/>
+        </w:rPr>
+        <w:t>}</w:t>
       </w:r>
       <w:r>
         <w:rPr>
@@ -3762,7 +4494,25 @@
           <w:sz w:val="18"/>
           <w:szCs w:val="18"/>
         </w:rPr>
-        <w:t>1.2. В соответствии с Поручением Клиент поручил Агенту совершить от имени Агента, но за счет Клиента, действия, направленные на приобретение цифровой валюты USDT (Tether) за денежные средства Клиента в валюте Российской Федерации и передачу приобретенной цифровой валюты на электронный кошелек Клиента.</w:t>
+        <w:t>1.2. В соответствии с Поручением Клиент поручил Агенту совершить от имени Агента, но за счет Клиента, действия, направленные на приобретение цифровой валюты USDT (</w:t>
+      </w:r>
+      <w:proofErr w:type="spellStart"/>
+      <w:r>
+        <w:rPr>
+          <w:rFonts w:ascii="Times New Roman" w:hAnsi="Times New Roman" w:cs="Times New Roman"/>
+          <w:sz w:val="18"/>
+          <w:szCs w:val="18"/>
+        </w:rPr>
+        <w:t>Tether</w:t>
+      </w:r>
+      <w:proofErr w:type="spellEnd"/>
+      <w:r>
+        <w:rPr>
+          <w:rFonts w:ascii="Times New Roman" w:hAnsi="Times New Roman" w:cs="Times New Roman"/>
+          <w:sz w:val="18"/>
+          <w:szCs w:val="18"/>
+        </w:rPr>
+        <w:t>) за денежные средства Клиента в валюте Российской Федерации и передачу приобретенной цифровой валюты на электронный кошелек Клиента.</w:t>
       </w:r>
     </w:p>
     <w:p>
@@ -3923,7 +4673,27 @@
           <w:szCs w:val="18"/>
           <w:lang w:val="en-US"/>
         </w:rPr>
-        <w:t>${paymentCustom.full_payment_amount}.</w:t>
+        <w:t>${</w:t>
+      </w:r>
+      <w:proofErr w:type="spellStart"/>
+      <w:r>
+        <w:rPr>
+          <w:rFonts w:ascii="Times New Roman" w:hAnsi="Times New Roman" w:cs="Times New Roman"/>
+          <w:sz w:val="18"/>
+          <w:szCs w:val="18"/>
+          <w:lang w:val="en-US"/>
+        </w:rPr>
+        <w:t>paymentCustom.full_payment_amount</w:t>
+      </w:r>
+      <w:proofErr w:type="spellEnd"/>
+      <w:r>
+        <w:rPr>
+          <w:rFonts w:ascii="Times New Roman" w:hAnsi="Times New Roman" w:cs="Times New Roman"/>
+          <w:sz w:val="18"/>
+          <w:szCs w:val="18"/>
+          <w:lang w:val="en-US"/>
+        </w:rPr>
+        <w:t>}.</w:t>
       </w:r>
     </w:p>
     <w:p>
@@ -3942,7 +4712,25 @@
           <w:sz w:val="18"/>
           <w:szCs w:val="18"/>
         </w:rPr>
-        <w:t>2.2. Указанные денежные средства были использованы Агентом для исполнения Поручения Клиента и совершения действий, направленных на приобретение цифровой валюты USDT (Tether).</w:t>
+        <w:t>2.2. Указанные денежные средства были использованы Агентом для исполнения Поручения Клиента и совершения действий, направленных на приобретение цифровой валюты USDT (</w:t>
+      </w:r>
+      <w:proofErr w:type="spellStart"/>
+      <w:r>
+        <w:rPr>
+          <w:rFonts w:ascii="Times New Roman" w:hAnsi="Times New Roman" w:cs="Times New Roman"/>
+          <w:sz w:val="18"/>
+          <w:szCs w:val="18"/>
+        </w:rPr>
+        <w:t>Tether</w:t>
+      </w:r>
+      <w:proofErr w:type="spellEnd"/>
+      <w:r>
+        <w:rPr>
+          <w:rFonts w:ascii="Times New Roman" w:hAnsi="Times New Roman" w:cs="Times New Roman"/>
+          <w:sz w:val="18"/>
+          <w:szCs w:val="18"/>
+        </w:rPr>
+        <w:t>).</w:t>
       </w:r>
     </w:p>
     <w:p>
@@ -3961,7 +4749,25 @@
           <w:sz w:val="18"/>
           <w:szCs w:val="18"/>
         </w:rPr>
-        <w:t>2.3. По результатам исполнения Поручения Агент передал Клиенту цифровую валюту USDT (Tether) в размере:</w:t>
+        <w:t>2.3. По результатам исполнения Поручения Агент передал Клиенту цифровую валюту USDT (</w:t>
+      </w:r>
+      <w:proofErr w:type="spellStart"/>
+      <w:r>
+        <w:rPr>
+          <w:rFonts w:ascii="Times New Roman" w:hAnsi="Times New Roman" w:cs="Times New Roman"/>
+          <w:sz w:val="18"/>
+          <w:szCs w:val="18"/>
+        </w:rPr>
+        <w:t>Tether</w:t>
+      </w:r>
+      <w:proofErr w:type="spellEnd"/>
+      <w:r>
+        <w:rPr>
+          <w:rFonts w:ascii="Times New Roman" w:hAnsi="Times New Roman" w:cs="Times New Roman"/>
+          <w:sz w:val="18"/>
+          <w:szCs w:val="18"/>
+        </w:rPr>
+        <w:t>) в размере:</w:t>
       </w:r>
     </w:p>
     <w:p>
@@ -4037,7 +4843,25 @@
           <w:sz w:val="18"/>
           <w:szCs w:val="18"/>
         </w:rPr>
-        <w:t>${paymentCustom.e_wallet}</w:t>
+        <w:t>${</w:t>
+      </w:r>
+      <w:proofErr w:type="spellStart"/>
+      <w:r>
+        <w:rPr>
+          <w:rFonts w:ascii="Times New Roman" w:hAnsi="Times New Roman" w:cs="Times New Roman"/>
+          <w:sz w:val="18"/>
+          <w:szCs w:val="18"/>
+        </w:rPr>
+        <w:t>paymentCustom.e_wallet</w:t>
+      </w:r>
+      <w:proofErr w:type="spellEnd"/>
+      <w:r>
+        <w:rPr>
+          <w:rFonts w:ascii="Times New Roman" w:hAnsi="Times New Roman" w:cs="Times New Roman"/>
+          <w:sz w:val="18"/>
+          <w:szCs w:val="18"/>
+        </w:rPr>
+        <w:t>}</w:t>
       </w:r>
       <w:r>
         <w:rPr>
@@ -4135,7 +4959,25 @@
           <w:sz w:val="18"/>
           <w:szCs w:val="18"/>
         </w:rPr>
-        <w:t>3.2. Клиент подтверждает, что принял исполнение по Поручению и получил цифровую валюту USDT (Tether) в размере и на электронный кошелек, указанные в настоящем Акте-отчете.</w:t>
+        <w:t>3.2. Клиент подтверждает, что принял исполнение по Поручению и получил цифровую валюту USDT (</w:t>
+      </w:r>
+      <w:proofErr w:type="spellStart"/>
+      <w:r>
+        <w:rPr>
+          <w:rFonts w:ascii="Times New Roman" w:hAnsi="Times New Roman" w:cs="Times New Roman"/>
+          <w:sz w:val="18"/>
+          <w:szCs w:val="18"/>
+        </w:rPr>
+        <w:t>Tether</w:t>
+      </w:r>
+      <w:proofErr w:type="spellEnd"/>
+      <w:r>
+        <w:rPr>
+          <w:rFonts w:ascii="Times New Roman" w:hAnsi="Times New Roman" w:cs="Times New Roman"/>
+          <w:sz w:val="18"/>
+          <w:szCs w:val="18"/>
+        </w:rPr>
+        <w:t>) в размере и на электронный кошелек, указанные в настоящем Акте-отчете.</w:t>
       </w:r>
     </w:p>
     <w:p>
@@ -4719,7 +5561,29 @@
                 <w:sz w:val="18"/>
                 <w:szCs w:val="18"/>
               </w:rPr>
-              <w:t>ФИО: Салеев Ярослав Станиславович</w:t>
+              <w:t xml:space="preserve">ФИО: </w:t>
+            </w:r>
+            <w:proofErr w:type="spellStart"/>
+            <w:r>
+              <w:rPr>
+                <w:rFonts w:ascii="Times New Roman" w:hAnsi="Times New Roman" w:cs="Times New Roman"/>
+                <w:color w:val="000000"/>
+                <w:kern w:val="28"/>
+                <w:sz w:val="18"/>
+                <w:szCs w:val="18"/>
+              </w:rPr>
+              <w:t>Салеев</w:t>
+            </w:r>
+            <w:proofErr w:type="spellEnd"/>
+            <w:r>
+              <w:rPr>
+                <w:rFonts w:ascii="Times New Roman" w:hAnsi="Times New Roman" w:cs="Times New Roman"/>
+                <w:color w:val="000000"/>
+                <w:kern w:val="28"/>
+                <w:sz w:val="18"/>
+                <w:szCs w:val="18"/>
+              </w:rPr>
+              <w:t xml:space="preserve"> Ярослав Станиславович</w:t>
             </w:r>
           </w:p>
           <w:p>
@@ -4746,8 +5610,19 @@
                 <w:szCs w:val="18"/>
                 <w:lang w:val="en-US"/>
               </w:rPr>
-              <w:t>: Директор</w:t>
-            </w:r>
+              <w:t xml:space="preserve">: </w:t>
+            </w:r>
+            <w:proofErr w:type="spellStart"/>
+            <w:r>
+              <w:rPr>
+                <w:rFonts w:ascii="Times New Roman" w:hAnsi="Times New Roman" w:cs="Times New Roman"/>
+                <w:sz w:val="18"/>
+                <w:szCs w:val="18"/>
+                <w:lang w:val="en-US"/>
+              </w:rPr>
+              <w:t>Директор</w:t>
+            </w:r>
+            <w:proofErr w:type="spellEnd"/>
           </w:p>
         </w:tc>
         <w:tc>
@@ -4928,7 +5803,7 @@
 </file>
 
 <file path=word/endnotes.xml><?xml version="1.0" encoding="utf-8"?>
-<w:endnotes xmlns:wpc="http://schemas.microsoft.com/office/word/2010/wordprocessingCanvas" xmlns:cx="http://schemas.microsoft.com/office/drawing/2014/chartex" xmlns:cx1="http://schemas.microsoft.com/office/drawing/2015/9/8/chartex" xmlns:cx2="http://schemas.microsoft.com/office/drawing/2015/10/21/chartex" xmlns:cx3="http://schemas.microsoft.com/office/drawing/2016/5/9/chartex" xmlns:cx4="http://schemas.microsoft.com/office/drawing/2016/5/10/chartex" xmlns:cx5="http://schemas.microsoft.com/office/drawing/2016/5/11/chartex" xmlns:cx6="http://schemas.microsoft.com/office/drawing/2016/5/12/chartex" xmlns:cx7="http://schemas.microsoft.com/office/drawing/2016/5/13/chartex" xmlns:cx8="http://schemas.microsoft.com/office/drawing/2016/5/14/chartex" xmlns:mc="http://schemas.openxmlformats.org/markup-compatibility/2006" xmlns:aink="http://schemas.microsoft.com/office/drawing/2016/ink" xmlns:am3d="http://schemas.microsoft.com/office/drawing/2017/model3d" xmlns:o="urn:schemas-microsoft-com:office:office" xmlns:oel="http://schemas.microsoft.com/office/2019/extlst" xmlns:r="http://schemas.openxmlformats.org/officeDocument/2006/relationships" xmlns:m="http://schemas.openxmlformats.org/officeDocument/2006/math" xmlns:v="urn:schemas-microsoft-com:vml" xmlns:wp14="http://schemas.microsoft.com/office/word/2010/wordprocessingDrawing" xmlns:wp="http://schemas.openxmlformats.org/drawingml/2006/wordprocessingDrawing" xmlns:w10="urn:schemas-microsoft-com:office:word" xmlns:w="http://schemas.openxmlformats.org/wordprocessingml/2006/main" xmlns:w14="http://schemas.microsoft.com/office/word/2010/wordml" xmlns:w15="http://schemas.microsoft.com/office/word/2012/wordml" xmlns:w16cex="http://schemas.microsoft.com/office/word/2018/wordml/cex" xmlns:w16cid="http://schemas.microsoft.com/office/word/2016/wordml/cid" xmlns:w16="http://schemas.microsoft.com/office/word/2018/wordml" xmlns:w16du="http://schemas.microsoft.com/office/word/2023/wordml/word16du" xmlns:w16sdtdh="http://schemas.microsoft.com/office/word/2020/wordml/sdtdatahash" xmlns:w16sdtfl="http://schemas.microsoft.com/office/word/2024/wordml/sdtformatlock" xmlns:w16se="http://schemas.microsoft.com/office/word/2015/wordml/symex" xmlns:wpg="http://schemas.microsoft.com/office/word/2010/wordprocessingGroup" xmlns:wpi="http://schemas.microsoft.com/office/word/2010/wordprocessingInk" xmlns:wne="http://schemas.microsoft.com/office/word/2006/wordml" xmlns:wps="http://schemas.microsoft.com/office/word/2010/wordprocessingShape" mc:Ignorable="w14 w15 w16se w16cid w16 w16cex w16sdtdh w16sdtfl w16du wp14">
+<w:endnotes xmlns:wpc="http://schemas.microsoft.com/office/word/2010/wordprocessingCanvas" xmlns:cx="http://schemas.microsoft.com/office/drawing/2014/chartex" xmlns:cx1="http://schemas.microsoft.com/office/drawing/2015/9/8/chartex" xmlns:cx2="http://schemas.microsoft.com/office/drawing/2015/10/21/chartex" xmlns:cx3="http://schemas.microsoft.com/office/drawing/2016/5/9/chartex" xmlns:cx4="http://schemas.microsoft.com/office/drawing/2016/5/10/chartex" xmlns:cx5="http://schemas.microsoft.com/office/drawing/2016/5/11/chartex" xmlns:cx6="http://schemas.microsoft.com/office/drawing/2016/5/12/chartex" xmlns:cx7="http://schemas.microsoft.com/office/drawing/2016/5/13/chartex" xmlns:cx8="http://schemas.microsoft.com/office/drawing/2016/5/14/chartex" xmlns:mc="http://schemas.openxmlformats.org/markup-compatibility/2006" xmlns:aink="http://schemas.microsoft.com/office/drawing/2016/ink" xmlns:am3d="http://schemas.microsoft.com/office/drawing/2017/model3d" xmlns:o="urn:schemas-microsoft-com:office:office" xmlns:r="http://schemas.openxmlformats.org/officeDocument/2006/relationships" xmlns:m="http://schemas.openxmlformats.org/officeDocument/2006/math" xmlns:v="urn:schemas-microsoft-com:vml" xmlns:wp14="http://schemas.microsoft.com/office/word/2010/wordprocessingDrawing" xmlns:wp="http://schemas.openxmlformats.org/drawingml/2006/wordprocessingDrawing" xmlns:w10="urn:schemas-microsoft-com:office:word" xmlns:w="http://schemas.openxmlformats.org/wordprocessingml/2006/main" xmlns:w14="http://schemas.microsoft.com/office/word/2010/wordml" xmlns:w15="http://schemas.microsoft.com/office/word/2012/wordml" xmlns:w16cex="http://schemas.microsoft.com/office/word/2018/wordml/cex" xmlns:w16cid="http://schemas.microsoft.com/office/word/2016/wordml/cid" xmlns:w16="http://schemas.microsoft.com/office/word/2018/wordml" xmlns:w16sdtdh="http://schemas.microsoft.com/office/word/2020/wordml/sdtdatahash" xmlns:w16se="http://schemas.microsoft.com/office/word/2015/wordml/symex" xmlns:wpg="http://schemas.microsoft.com/office/word/2010/wordprocessingGroup" xmlns:wpi="http://schemas.microsoft.com/office/word/2010/wordprocessingInk" xmlns:wne="http://schemas.microsoft.com/office/word/2006/wordml" xmlns:wps="http://schemas.microsoft.com/office/word/2010/wordprocessingShape" mc:Ignorable="w14 w15 w16se w16cid w16 w16cex w16sdtdh wp14">
   <w:endnote w:type="separator" w:id="-1">
     <w:p>
       <w:r>
@@ -4947,7 +5822,7 @@
 </file>
 
 <file path=word/footer1.xml><?xml version="1.0" encoding="utf-8"?>
-<w:ftr xmlns:wpc="http://schemas.microsoft.com/office/word/2010/wordprocessingCanvas" xmlns:cx="http://schemas.microsoft.com/office/drawing/2014/chartex" xmlns:cx1="http://schemas.microsoft.com/office/drawing/2015/9/8/chartex" xmlns:cx2="http://schemas.microsoft.com/office/drawing/2015/10/21/chartex" xmlns:cx3="http://schemas.microsoft.com/office/drawing/2016/5/9/chartex" xmlns:cx4="http://schemas.microsoft.com/office/drawing/2016/5/10/chartex" xmlns:cx5="http://schemas.microsoft.com/office/drawing/2016/5/11/chartex" xmlns:cx6="http://schemas.microsoft.com/office/drawing/2016/5/12/chartex" xmlns:cx7="http://schemas.microsoft.com/office/drawing/2016/5/13/chartex" xmlns:cx8="http://schemas.microsoft.com/office/drawing/2016/5/14/chartex" xmlns:mc="http://schemas.openxmlformats.org/markup-compatibility/2006" xmlns:aink="http://schemas.microsoft.com/office/drawing/2016/ink" xmlns:am3d="http://schemas.microsoft.com/office/drawing/2017/model3d" xmlns:o="urn:schemas-microsoft-com:office:office" xmlns:oel="http://schemas.microsoft.com/office/2019/extlst" xmlns:r="http://schemas.openxmlformats.org/officeDocument/2006/relationships" xmlns:m="http://schemas.openxmlformats.org/officeDocument/2006/math" xmlns:v="urn:schemas-microsoft-com:vml" xmlns:wp14="http://schemas.microsoft.com/office/word/2010/wordprocessingDrawing" xmlns:wp="http://schemas.openxmlformats.org/drawingml/2006/wordprocessingDrawing" xmlns:w10="urn:schemas-microsoft-com:office:word" xmlns:w="http://schemas.openxmlformats.org/wordprocessingml/2006/main" xmlns:w14="http://schemas.microsoft.com/office/word/2010/wordml" xmlns:w15="http://schemas.microsoft.com/office/word/2012/wordml" xmlns:w16cex="http://schemas.microsoft.com/office/word/2018/wordml/cex" xmlns:w16cid="http://schemas.microsoft.com/office/word/2016/wordml/cid" xmlns:w16="http://schemas.microsoft.com/office/word/2018/wordml" xmlns:w16du="http://schemas.microsoft.com/office/word/2023/wordml/word16du" xmlns:w16sdtdh="http://schemas.microsoft.com/office/word/2020/wordml/sdtdatahash" xmlns:w16sdtfl="http://schemas.microsoft.com/office/word/2024/wordml/sdtformatlock" xmlns:w16se="http://schemas.microsoft.com/office/word/2015/wordml/symex" xmlns:wpg="http://schemas.microsoft.com/office/word/2010/wordprocessingGroup" xmlns:wpi="http://schemas.microsoft.com/office/word/2010/wordprocessingInk" xmlns:wne="http://schemas.microsoft.com/office/word/2006/wordml" xmlns:wps="http://schemas.microsoft.com/office/word/2010/wordprocessingShape" mc:Ignorable="w14 w15 w16se w16cid w16 w16cex w16sdtdh w16sdtfl w16du wp14">
+<w:ftr xmlns:wpc="http://schemas.microsoft.com/office/word/2010/wordprocessingCanvas" xmlns:cx="http://schemas.microsoft.com/office/drawing/2014/chartex" xmlns:cx1="http://schemas.microsoft.com/office/drawing/2015/9/8/chartex" xmlns:cx2="http://schemas.microsoft.com/office/drawing/2015/10/21/chartex" xmlns:cx3="http://schemas.microsoft.com/office/drawing/2016/5/9/chartex" xmlns:cx4="http://schemas.microsoft.com/office/drawing/2016/5/10/chartex" xmlns:cx5="http://schemas.microsoft.com/office/drawing/2016/5/11/chartex" xmlns:cx6="http://schemas.microsoft.com/office/drawing/2016/5/12/chartex" xmlns:cx7="http://schemas.microsoft.com/office/drawing/2016/5/13/chartex" xmlns:cx8="http://schemas.microsoft.com/office/drawing/2016/5/14/chartex" xmlns:mc="http://schemas.openxmlformats.org/markup-compatibility/2006" xmlns:aink="http://schemas.microsoft.com/office/drawing/2016/ink" xmlns:am3d="http://schemas.microsoft.com/office/drawing/2017/model3d" xmlns:o="urn:schemas-microsoft-com:office:office" xmlns:r="http://schemas.openxmlformats.org/officeDocument/2006/relationships" xmlns:m="http://schemas.openxmlformats.org/officeDocument/2006/math" xmlns:v="urn:schemas-microsoft-com:vml" xmlns:wp14="http://schemas.microsoft.com/office/word/2010/wordprocessingDrawing" xmlns:wp="http://schemas.openxmlformats.org/drawingml/2006/wordprocessingDrawing" xmlns:w10="urn:schemas-microsoft-com:office:word" xmlns:w="http://schemas.openxmlformats.org/wordprocessingml/2006/main" xmlns:w14="http://schemas.microsoft.com/office/word/2010/wordml" xmlns:w15="http://schemas.microsoft.com/office/word/2012/wordml" xmlns:w16cex="http://schemas.microsoft.com/office/word/2018/wordml/cex" xmlns:w16cid="http://schemas.microsoft.com/office/word/2016/wordml/cid" xmlns:w16="http://schemas.microsoft.com/office/word/2018/wordml" xmlns:w16sdtdh="http://schemas.microsoft.com/office/word/2020/wordml/sdtdatahash" xmlns:w16se="http://schemas.microsoft.com/office/word/2015/wordml/symex" xmlns:wpg="http://schemas.microsoft.com/office/word/2010/wordprocessingGroup" xmlns:wpi="http://schemas.microsoft.com/office/word/2010/wordprocessingInk" xmlns:wne="http://schemas.microsoft.com/office/word/2006/wordml" xmlns:wps="http://schemas.microsoft.com/office/word/2010/wordprocessingShape" mc:Ignorable="w14 w15 w16se w16cid w16 w16cex w16sdtdh wp14">
   <w:sdt>
     <w:sdtPr>
       <w:rPr>
@@ -5043,7 +5918,7 @@
 </file>
 
 <file path=word/footer2.xml><?xml version="1.0" encoding="utf-8"?>
-<w:ftr xmlns:wpc="http://schemas.microsoft.com/office/word/2010/wordprocessingCanvas" xmlns:cx="http://schemas.microsoft.com/office/drawing/2014/chartex" xmlns:cx1="http://schemas.microsoft.com/office/drawing/2015/9/8/chartex" xmlns:cx2="http://schemas.microsoft.com/office/drawing/2015/10/21/chartex" xmlns:cx3="http://schemas.microsoft.com/office/drawing/2016/5/9/chartex" xmlns:cx4="http://schemas.microsoft.com/office/drawing/2016/5/10/chartex" xmlns:cx5="http://schemas.microsoft.com/office/drawing/2016/5/11/chartex" xmlns:cx6="http://schemas.microsoft.com/office/drawing/2016/5/12/chartex" xmlns:cx7="http://schemas.microsoft.com/office/drawing/2016/5/13/chartex" xmlns:cx8="http://schemas.microsoft.com/office/drawing/2016/5/14/chartex" xmlns:mc="http://schemas.openxmlformats.org/markup-compatibility/2006" xmlns:aink="http://schemas.microsoft.com/office/drawing/2016/ink" xmlns:am3d="http://schemas.microsoft.com/office/drawing/2017/model3d" xmlns:o="urn:schemas-microsoft-com:office:office" xmlns:oel="http://schemas.microsoft.com/office/2019/extlst" xmlns:r="http://schemas.openxmlformats.org/officeDocument/2006/relationships" xmlns:m="http://schemas.openxmlformats.org/officeDocument/2006/math" xmlns:v="urn:schemas-microsoft-com:vml" xmlns:wp14="http://schemas.microsoft.com/office/word/2010/wordprocessingDrawing" xmlns:wp="http://schemas.openxmlformats.org/drawingml/2006/wordprocessingDrawing" xmlns:w10="urn:schemas-microsoft-com:office:word" xmlns:w="http://schemas.openxmlformats.org/wordprocessingml/2006/main" xmlns:w14="http://schemas.microsoft.com/office/word/2010/wordml" xmlns:w15="http://schemas.microsoft.com/office/word/2012/wordml" xmlns:w16cex="http://schemas.microsoft.com/office/word/2018/wordml/cex" xmlns:w16cid="http://schemas.microsoft.com/office/word/2016/wordml/cid" xmlns:w16="http://schemas.microsoft.com/office/word/2018/wordml" xmlns:w16du="http://schemas.microsoft.com/office/word/2023/wordml/word16du" xmlns:w16sdtdh="http://schemas.microsoft.com/office/word/2020/wordml/sdtdatahash" xmlns:w16sdtfl="http://schemas.microsoft.com/office/word/2024/wordml/sdtformatlock" xmlns:w16se="http://schemas.microsoft.com/office/word/2015/wordml/symex" xmlns:wpg="http://schemas.microsoft.com/office/word/2010/wordprocessingGroup" xmlns:wpi="http://schemas.microsoft.com/office/word/2010/wordprocessingInk" xmlns:wne="http://schemas.microsoft.com/office/word/2006/wordml" xmlns:wps="http://schemas.microsoft.com/office/word/2010/wordprocessingShape" mc:Ignorable="w14 w15 w16se w16cid w16 w16cex w16sdtdh w16sdtfl w16du wp14">
+<w:ftr xmlns:wpc="http://schemas.microsoft.com/office/word/2010/wordprocessingCanvas" xmlns:cx="http://schemas.microsoft.com/office/drawing/2014/chartex" xmlns:cx1="http://schemas.microsoft.com/office/drawing/2015/9/8/chartex" xmlns:cx2="http://schemas.microsoft.com/office/drawing/2015/10/21/chartex" xmlns:cx3="http://schemas.microsoft.com/office/drawing/2016/5/9/chartex" xmlns:cx4="http://schemas.microsoft.com/office/drawing/2016/5/10/chartex" xmlns:cx5="http://schemas.microsoft.com/office/drawing/2016/5/11/chartex" xmlns:cx6="http://schemas.microsoft.com/office/drawing/2016/5/12/chartex" xmlns:cx7="http://schemas.microsoft.com/office/drawing/2016/5/13/chartex" xmlns:cx8="http://schemas.microsoft.com/office/drawing/2016/5/14/chartex" xmlns:mc="http://schemas.openxmlformats.org/markup-compatibility/2006" xmlns:aink="http://schemas.microsoft.com/office/drawing/2016/ink" xmlns:am3d="http://schemas.microsoft.com/office/drawing/2017/model3d" xmlns:o="urn:schemas-microsoft-com:office:office" xmlns:r="http://schemas.openxmlformats.org/officeDocument/2006/relationships" xmlns:m="http://schemas.openxmlformats.org/officeDocument/2006/math" xmlns:v="urn:schemas-microsoft-com:vml" xmlns:wp14="http://schemas.microsoft.com/office/word/2010/wordprocessingDrawing" xmlns:wp="http://schemas.openxmlformats.org/drawingml/2006/wordprocessingDrawing" xmlns:w10="urn:schemas-microsoft-com:office:word" xmlns:w="http://schemas.openxmlformats.org/wordprocessingml/2006/main" xmlns:w14="http://schemas.microsoft.com/office/word/2010/wordml" xmlns:w15="http://schemas.microsoft.com/office/word/2012/wordml" xmlns:w16cex="http://schemas.microsoft.com/office/word/2018/wordml/cex" xmlns:w16cid="http://schemas.microsoft.com/office/word/2016/wordml/cid" xmlns:w16="http://schemas.microsoft.com/office/word/2018/wordml" xmlns:w16sdtdh="http://schemas.microsoft.com/office/word/2020/wordml/sdtdatahash" xmlns:w16se="http://schemas.microsoft.com/office/word/2015/wordml/symex" xmlns:wpg="http://schemas.microsoft.com/office/word/2010/wordprocessingGroup" xmlns:wpi="http://schemas.microsoft.com/office/word/2010/wordprocessingInk" xmlns:wne="http://schemas.microsoft.com/office/word/2006/wordml" xmlns:wps="http://schemas.microsoft.com/office/word/2010/wordprocessingShape" mc:Ignorable="w14 w15 w16se w16cid w16 w16cex w16sdtdh wp14">
   <w:p>
     <w:pPr>
       <w:pStyle w:val="a7"/>
@@ -5066,7 +5941,7 @@
 </file>
 
 <file path=word/footer3.xml><?xml version="1.0" encoding="utf-8"?>
-<w:ftr xmlns:wpc="http://schemas.microsoft.com/office/word/2010/wordprocessingCanvas" xmlns:cx="http://schemas.microsoft.com/office/drawing/2014/chartex" xmlns:cx1="http://schemas.microsoft.com/office/drawing/2015/9/8/chartex" xmlns:cx2="http://schemas.microsoft.com/office/drawing/2015/10/21/chartex" xmlns:cx3="http://schemas.microsoft.com/office/drawing/2016/5/9/chartex" xmlns:cx4="http://schemas.microsoft.com/office/drawing/2016/5/10/chartex" xmlns:cx5="http://schemas.microsoft.com/office/drawing/2016/5/11/chartex" xmlns:cx6="http://schemas.microsoft.com/office/drawing/2016/5/12/chartex" xmlns:cx7="http://schemas.microsoft.com/office/drawing/2016/5/13/chartex" xmlns:cx8="http://schemas.microsoft.com/office/drawing/2016/5/14/chartex" xmlns:mc="http://schemas.openxmlformats.org/markup-compatibility/2006" xmlns:aink="http://schemas.microsoft.com/office/drawing/2016/ink" xmlns:am3d="http://schemas.microsoft.com/office/drawing/2017/model3d" xmlns:o="urn:schemas-microsoft-com:office:office" xmlns:oel="http://schemas.microsoft.com/office/2019/extlst" xmlns:r="http://schemas.openxmlformats.org/officeDocument/2006/relationships" xmlns:m="http://schemas.openxmlformats.org/officeDocument/2006/math" xmlns:v="urn:schemas-microsoft-com:vml" xmlns:wp14="http://schemas.microsoft.com/office/word/2010/wordprocessingDrawing" xmlns:wp="http://schemas.openxmlformats.org/drawingml/2006/wordprocessingDrawing" xmlns:w10="urn:schemas-microsoft-com:office:word" xmlns:w="http://schemas.openxmlformats.org/wordprocessingml/2006/main" xmlns:w14="http://schemas.microsoft.com/office/word/2010/wordml" xmlns:w15="http://schemas.microsoft.com/office/word/2012/wordml" xmlns:w16cex="http://schemas.microsoft.com/office/word/2018/wordml/cex" xmlns:w16cid="http://schemas.microsoft.com/office/word/2016/wordml/cid" xmlns:w16="http://schemas.microsoft.com/office/word/2018/wordml" xmlns:w16du="http://schemas.microsoft.com/office/word/2023/wordml/word16du" xmlns:w16sdtdh="http://schemas.microsoft.com/office/word/2020/wordml/sdtdatahash" xmlns:w16sdtfl="http://schemas.microsoft.com/office/word/2024/wordml/sdtformatlock" xmlns:w16se="http://schemas.microsoft.com/office/word/2015/wordml/symex" xmlns:wpg="http://schemas.microsoft.com/office/word/2010/wordprocessingGroup" xmlns:wpi="http://schemas.microsoft.com/office/word/2010/wordprocessingInk" xmlns:wne="http://schemas.microsoft.com/office/word/2006/wordml" xmlns:wps="http://schemas.microsoft.com/office/word/2010/wordprocessingShape" mc:Ignorable="w14 w15 w16se w16cid w16 w16cex w16sdtdh w16sdtfl w16du wp14">
+<w:ftr xmlns:wpc="http://schemas.microsoft.com/office/word/2010/wordprocessingCanvas" xmlns:cx="http://schemas.microsoft.com/office/drawing/2014/chartex" xmlns:cx1="http://schemas.microsoft.com/office/drawing/2015/9/8/chartex" xmlns:cx2="http://schemas.microsoft.com/office/drawing/2015/10/21/chartex" xmlns:cx3="http://schemas.microsoft.com/office/drawing/2016/5/9/chartex" xmlns:cx4="http://schemas.microsoft.com/office/drawing/2016/5/10/chartex" xmlns:cx5="http://schemas.microsoft.com/office/drawing/2016/5/11/chartex" xmlns:cx6="http://schemas.microsoft.com/office/drawing/2016/5/12/chartex" xmlns:cx7="http://schemas.microsoft.com/office/drawing/2016/5/13/chartex" xmlns:cx8="http://schemas.microsoft.com/office/drawing/2016/5/14/chartex" xmlns:mc="http://schemas.openxmlformats.org/markup-compatibility/2006" xmlns:aink="http://schemas.microsoft.com/office/drawing/2016/ink" xmlns:am3d="http://schemas.microsoft.com/office/drawing/2017/model3d" xmlns:o="urn:schemas-microsoft-com:office:office" xmlns:r="http://schemas.openxmlformats.org/officeDocument/2006/relationships" xmlns:m="http://schemas.openxmlformats.org/officeDocument/2006/math" xmlns:v="urn:schemas-microsoft-com:vml" xmlns:wp14="http://schemas.microsoft.com/office/word/2010/wordprocessingDrawing" xmlns:wp="http://schemas.openxmlformats.org/drawingml/2006/wordprocessingDrawing" xmlns:w10="urn:schemas-microsoft-com:office:word" xmlns:w="http://schemas.openxmlformats.org/wordprocessingml/2006/main" xmlns:w14="http://schemas.microsoft.com/office/word/2010/wordml" xmlns:w15="http://schemas.microsoft.com/office/word/2012/wordml" xmlns:w16cex="http://schemas.microsoft.com/office/word/2018/wordml/cex" xmlns:w16cid="http://schemas.microsoft.com/office/word/2016/wordml/cid" xmlns:w16="http://schemas.microsoft.com/office/word/2018/wordml" xmlns:w16sdtdh="http://schemas.microsoft.com/office/word/2020/wordml/sdtdatahash" xmlns:w16se="http://schemas.microsoft.com/office/word/2015/wordml/symex" xmlns:wpg="http://schemas.microsoft.com/office/word/2010/wordprocessingGroup" xmlns:wpi="http://schemas.microsoft.com/office/word/2010/wordprocessingInk" xmlns:wne="http://schemas.microsoft.com/office/word/2006/wordml" xmlns:wps="http://schemas.microsoft.com/office/word/2010/wordprocessingShape" mc:Ignorable="w14 w15 w16se w16cid w16 w16cex w16sdtdh wp14">
   <w:p>
     <w:pPr>
       <w:pStyle w:val="a7"/>
@@ -5090,7 +5965,7 @@
 </file>
 
 <file path=word/footnotes.xml><?xml version="1.0" encoding="utf-8"?>
-<w:footnotes xmlns:wpc="http://schemas.microsoft.com/office/word/2010/wordprocessingCanvas" xmlns:cx="http://schemas.microsoft.com/office/drawing/2014/chartex" xmlns:cx1="http://schemas.microsoft.com/office/drawing/2015/9/8/chartex" xmlns:cx2="http://schemas.microsoft.com/office/drawing/2015/10/21/chartex" xmlns:cx3="http://schemas.microsoft.com/office/drawing/2016/5/9/chartex" xmlns:cx4="http://schemas.microsoft.com/office/drawing/2016/5/10/chartex" xmlns:cx5="http://schemas.microsoft.com/office/drawing/2016/5/11/chartex" xmlns:cx6="http://schemas.microsoft.com/office/drawing/2016/5/12/chartex" xmlns:cx7="http://schemas.microsoft.com/office/drawing/2016/5/13/chartex" xmlns:cx8="http://schemas.microsoft.com/office/drawing/2016/5/14/chartex" xmlns:mc="http://schemas.openxmlformats.org/markup-compatibility/2006" xmlns:aink="http://schemas.microsoft.com/office/drawing/2016/ink" xmlns:am3d="http://schemas.microsoft.com/office/drawing/2017/model3d" xmlns:o="urn:schemas-microsoft-com:office:office" xmlns:oel="http://schemas.microsoft.com/office/2019/extlst" xmlns:r="http://schemas.openxmlformats.org/officeDocument/2006/relationships" xmlns:m="http://schemas.openxmlformats.org/officeDocument/2006/math" xmlns:v="urn:schemas-microsoft-com:vml" xmlns:wp14="http://schemas.microsoft.com/office/word/2010/wordprocessingDrawing" xmlns:wp="http://schemas.openxmlformats.org/drawingml/2006/wordprocessingDrawing" xmlns:w10="urn:schemas-microsoft-com:office:word" xmlns:w="http://schemas.openxmlformats.org/wordprocessingml/2006/main" xmlns:w14="http://schemas.microsoft.com/office/word/2010/wordml" xmlns:w15="http://schemas.microsoft.com/office/word/2012/wordml" xmlns:w16cex="http://schemas.microsoft.com/office/word/2018/wordml/cex" xmlns:w16cid="http://schemas.microsoft.com/office/word/2016/wordml/cid" xmlns:w16="http://schemas.microsoft.com/office/word/2018/wordml" xmlns:w16du="http://schemas.microsoft.com/office/word/2023/wordml/word16du" xmlns:w16sdtdh="http://schemas.microsoft.com/office/word/2020/wordml/sdtdatahash" xmlns:w16sdtfl="http://schemas.microsoft.com/office/word/2024/wordml/sdtformatlock" xmlns:w16se="http://schemas.microsoft.com/office/word/2015/wordml/symex" xmlns:wpg="http://schemas.microsoft.com/office/word/2010/wordprocessingGroup" xmlns:wpi="http://schemas.microsoft.com/office/word/2010/wordprocessingInk" xmlns:wne="http://schemas.microsoft.com/office/word/2006/wordml" xmlns:wps="http://schemas.microsoft.com/office/word/2010/wordprocessingShape" mc:Ignorable="w14 w15 w16se w16cid w16 w16cex w16sdtdh w16sdtfl w16du wp14">
+<w:footnotes xmlns:wpc="http://schemas.microsoft.com/office/word/2010/wordprocessingCanvas" xmlns:cx="http://schemas.microsoft.com/office/drawing/2014/chartex" xmlns:cx1="http://schemas.microsoft.com/office/drawing/2015/9/8/chartex" xmlns:cx2="http://schemas.microsoft.com/office/drawing/2015/10/21/chartex" xmlns:cx3="http://schemas.microsoft.com/office/drawing/2016/5/9/chartex" xmlns:cx4="http://schemas.microsoft.com/office/drawing/2016/5/10/chartex" xmlns:cx5="http://schemas.microsoft.com/office/drawing/2016/5/11/chartex" xmlns:cx6="http://schemas.microsoft.com/office/drawing/2016/5/12/chartex" xmlns:cx7="http://schemas.microsoft.com/office/drawing/2016/5/13/chartex" xmlns:cx8="http://schemas.microsoft.com/office/drawing/2016/5/14/chartex" xmlns:mc="http://schemas.openxmlformats.org/markup-compatibility/2006" xmlns:aink="http://schemas.microsoft.com/office/drawing/2016/ink" xmlns:am3d="http://schemas.microsoft.com/office/drawing/2017/model3d" xmlns:o="urn:schemas-microsoft-com:office:office" xmlns:r="http://schemas.openxmlformats.org/officeDocument/2006/relationships" xmlns:m="http://schemas.openxmlformats.org/officeDocument/2006/math" xmlns:v="urn:schemas-microsoft-com:vml" xmlns:wp14="http://schemas.microsoft.com/office/word/2010/wordprocessingDrawing" xmlns:wp="http://schemas.openxmlformats.org/drawingml/2006/wordprocessingDrawing" xmlns:w10="urn:schemas-microsoft-com:office:word" xmlns:w="http://schemas.openxmlformats.org/wordprocessingml/2006/main" xmlns:w14="http://schemas.microsoft.com/office/word/2010/wordml" xmlns:w15="http://schemas.microsoft.com/office/word/2012/wordml" xmlns:w16cex="http://schemas.microsoft.com/office/word/2018/wordml/cex" xmlns:w16cid="http://schemas.microsoft.com/office/word/2016/wordml/cid" xmlns:w16="http://schemas.microsoft.com/office/word/2018/wordml" xmlns:w16sdtdh="http://schemas.microsoft.com/office/word/2020/wordml/sdtdatahash" xmlns:w16se="http://schemas.microsoft.com/office/word/2015/wordml/symex" xmlns:wpg="http://schemas.microsoft.com/office/word/2010/wordprocessingGroup" xmlns:wpi="http://schemas.microsoft.com/office/word/2010/wordprocessingInk" xmlns:wne="http://schemas.microsoft.com/office/word/2006/wordml" xmlns:wps="http://schemas.microsoft.com/office/word/2010/wordprocessingShape" mc:Ignorable="w14 w15 w16se w16cid w16 w16cex w16sdtdh wp14">
   <w:footnote w:type="separator" w:id="-1">
     <w:p>
       <w:r>
@@ -5109,7 +5984,7 @@
 </file>
 
 <file path=word/numbering.xml><?xml version="1.0" encoding="utf-8"?>
-<w:numbering xmlns:wpc="http://schemas.microsoft.com/office/word/2010/wordprocessingCanvas" xmlns:cx="http://schemas.microsoft.com/office/drawing/2014/chartex" xmlns:cx1="http://schemas.microsoft.com/office/drawing/2015/9/8/chartex" xmlns:cx2="http://schemas.microsoft.com/office/drawing/2015/10/21/chartex" xmlns:cx3="http://schemas.microsoft.com/office/drawing/2016/5/9/chartex" xmlns:cx4="http://schemas.microsoft.com/office/drawing/2016/5/10/chartex" xmlns:cx5="http://schemas.microsoft.com/office/drawing/2016/5/11/chartex" xmlns:cx6="http://schemas.microsoft.com/office/drawing/2016/5/12/chartex" xmlns:cx7="http://schemas.microsoft.com/office/drawing/2016/5/13/chartex" xmlns:cx8="http://schemas.microsoft.com/office/drawing/2016/5/14/chartex" xmlns:mc="http://schemas.openxmlformats.org/markup-compatibility/2006" xmlns:aink="http://schemas.microsoft.com/office/drawing/2016/ink" xmlns:am3d="http://schemas.microsoft.com/office/drawing/2017/model3d" xmlns:o="urn:schemas-microsoft-com:office:office" xmlns:oel="http://schemas.microsoft.com/office/2019/extlst" xmlns:r="http://schemas.openxmlformats.org/officeDocument/2006/relationships" xmlns:m="http://schemas.openxmlformats.org/officeDocument/2006/math" xmlns:v="urn:schemas-microsoft-com:vml" xmlns:wp14="http://schemas.microsoft.com/office/word/2010/wordprocessingDrawing" xmlns:wp="http://schemas.openxmlformats.org/drawingml/2006/wordprocessingDrawing" xmlns:w10="urn:schemas-microsoft-com:office:word" xmlns:w="http://schemas.openxmlformats.org/wordprocessingml/2006/main" xmlns:w14="http://schemas.microsoft.com/office/word/2010/wordml" xmlns:w15="http://schemas.microsoft.com/office/word/2012/wordml" xmlns:w16cex="http://schemas.microsoft.com/office/word/2018/wordml/cex" xmlns:w16cid="http://schemas.microsoft.com/office/word/2016/wordml/cid" xmlns:w16="http://schemas.microsoft.com/office/word/2018/wordml" xmlns:w16du="http://schemas.microsoft.com/office/word/2023/wordml/word16du" xmlns:w16sdtdh="http://schemas.microsoft.com/office/word/2020/wordml/sdtdatahash" xmlns:w16sdtfl="http://schemas.microsoft.com/office/word/2024/wordml/sdtformatlock" xmlns:w16se="http://schemas.microsoft.com/office/word/2015/wordml/symex" xmlns:wpg="http://schemas.microsoft.com/office/word/2010/wordprocessingGroup" xmlns:wpi="http://schemas.microsoft.com/office/word/2010/wordprocessingInk" xmlns:wne="http://schemas.microsoft.com/office/word/2006/wordml" xmlns:wps="http://schemas.microsoft.com/office/word/2010/wordprocessingShape" mc:Ignorable="w14 w15 w16se w16cid w16 w16cex w16sdtdh w16sdtfl w16du wp14">
+<w:numbering xmlns:wpc="http://schemas.microsoft.com/office/word/2010/wordprocessingCanvas" xmlns:cx="http://schemas.microsoft.com/office/drawing/2014/chartex" xmlns:cx1="http://schemas.microsoft.com/office/drawing/2015/9/8/chartex" xmlns:cx2="http://schemas.microsoft.com/office/drawing/2015/10/21/chartex" xmlns:cx3="http://schemas.microsoft.com/office/drawing/2016/5/9/chartex" xmlns:cx4="http://schemas.microsoft.com/office/drawing/2016/5/10/chartex" xmlns:cx5="http://schemas.microsoft.com/office/drawing/2016/5/11/chartex" xmlns:cx6="http://schemas.microsoft.com/office/drawing/2016/5/12/chartex" xmlns:cx7="http://schemas.microsoft.com/office/drawing/2016/5/13/chartex" xmlns:cx8="http://schemas.microsoft.com/office/drawing/2016/5/14/chartex" xmlns:mc="http://schemas.openxmlformats.org/markup-compatibility/2006" xmlns:aink="http://schemas.microsoft.com/office/drawing/2016/ink" xmlns:am3d="http://schemas.microsoft.com/office/drawing/2017/model3d" xmlns:o="urn:schemas-microsoft-com:office:office" xmlns:r="http://schemas.openxmlformats.org/officeDocument/2006/relationships" xmlns:m="http://schemas.openxmlformats.org/officeDocument/2006/math" xmlns:v="urn:schemas-microsoft-com:vml" xmlns:wp14="http://schemas.microsoft.com/office/word/2010/wordprocessingDrawing" xmlns:wp="http://schemas.openxmlformats.org/drawingml/2006/wordprocessingDrawing" xmlns:w10="urn:schemas-microsoft-com:office:word" xmlns:w="http://schemas.openxmlformats.org/wordprocessingml/2006/main" xmlns:w14="http://schemas.microsoft.com/office/word/2010/wordml" xmlns:w15="http://schemas.microsoft.com/office/word/2012/wordml" xmlns:w16cex="http://schemas.microsoft.com/office/word/2018/wordml/cex" xmlns:w16cid="http://schemas.microsoft.com/office/word/2016/wordml/cid" xmlns:w16="http://schemas.microsoft.com/office/word/2018/wordml" xmlns:w16sdtdh="http://schemas.microsoft.com/office/word/2020/wordml/sdtdatahash" xmlns:w16se="http://schemas.microsoft.com/office/word/2015/wordml/symex" xmlns:wpg="http://schemas.microsoft.com/office/word/2010/wordprocessingGroup" xmlns:wpi="http://schemas.microsoft.com/office/word/2010/wordprocessingInk" xmlns:wne="http://schemas.microsoft.com/office/word/2006/wordml" xmlns:wps="http://schemas.microsoft.com/office/word/2010/wordprocessingShape" mc:Ignorable="w14 w15 w16se w16cid w16 w16cex w16sdtdh wp14">
   <w:abstractNum w:abstractNumId="0" w15:restartNumberingAfterBreak="0">
     <w:nsid w:val="00C236BB"/>
     <w:multiLevelType w:val="hybridMultilevel"/>
@@ -6038,38 +6913,38 @@
       </w:rPr>
     </w:lvl>
   </w:abstractNum>
-  <w:num w:numId="1" w16cid:durableId="842009185">
+  <w:num w:numId="1">
     <w:abstractNumId w:val="5"/>
   </w:num>
-  <w:num w:numId="2" w16cid:durableId="310597209">
+  <w:num w:numId="2">
     <w:abstractNumId w:val="7"/>
   </w:num>
-  <w:num w:numId="3" w16cid:durableId="2018728770">
+  <w:num w:numId="3">
     <w:abstractNumId w:val="3"/>
   </w:num>
-  <w:num w:numId="4" w16cid:durableId="1426414461">
+  <w:num w:numId="4">
     <w:abstractNumId w:val="0"/>
   </w:num>
-  <w:num w:numId="5" w16cid:durableId="1199585775">
+  <w:num w:numId="5">
     <w:abstractNumId w:val="1"/>
   </w:num>
-  <w:num w:numId="6" w16cid:durableId="10223757">
+  <w:num w:numId="6">
     <w:abstractNumId w:val="2"/>
   </w:num>
-  <w:num w:numId="7" w16cid:durableId="1229222882">
+  <w:num w:numId="7">
     <w:abstractNumId w:val="8"/>
   </w:num>
-  <w:num w:numId="8" w16cid:durableId="47804711">
+  <w:num w:numId="8">
     <w:abstractNumId w:val="6"/>
   </w:num>
-  <w:num w:numId="9" w16cid:durableId="200555823">
+  <w:num w:numId="9">
     <w:abstractNumId w:val="4"/>
   </w:num>
 </w:numbering>
 </file>
 
 <file path=word/styles.xml><?xml version="1.0" encoding="utf-8"?>
-<w:styles xmlns:mc="http://schemas.openxmlformats.org/markup-compatibility/2006" xmlns:r="http://schemas.openxmlformats.org/officeDocument/2006/relationships" xmlns:w="http://schemas.openxmlformats.org/wordprocessingml/2006/main" xmlns:w14="http://schemas.microsoft.com/office/word/2010/wordml" xmlns:w15="http://schemas.microsoft.com/office/word/2012/wordml" xmlns:w16cex="http://schemas.microsoft.com/office/word/2018/wordml/cex" xmlns:w16cid="http://schemas.microsoft.com/office/word/2016/wordml/cid" xmlns:w16="http://schemas.microsoft.com/office/word/2018/wordml" xmlns:w16du="http://schemas.microsoft.com/office/word/2023/wordml/word16du" xmlns:w16sdtdh="http://schemas.microsoft.com/office/word/2020/wordml/sdtdatahash" xmlns:w16sdtfl="http://schemas.microsoft.com/office/word/2024/wordml/sdtformatlock" xmlns:w16se="http://schemas.microsoft.com/office/word/2015/wordml/symex" mc:Ignorable="w14 w15 w16se w16cid w16 w16cex w16sdtdh w16sdtfl w16du">
+<w:styles xmlns:mc="http://schemas.openxmlformats.org/markup-compatibility/2006" xmlns:r="http://schemas.openxmlformats.org/officeDocument/2006/relationships" xmlns:w="http://schemas.openxmlformats.org/wordprocessingml/2006/main" xmlns:w14="http://schemas.microsoft.com/office/word/2010/wordml" xmlns:w15="http://schemas.microsoft.com/office/word/2012/wordml" xmlns:w16cex="http://schemas.microsoft.com/office/word/2018/wordml/cex" xmlns:w16cid="http://schemas.microsoft.com/office/word/2016/wordml/cid" xmlns:w16="http://schemas.microsoft.com/office/word/2018/wordml" xmlns:w16sdtdh="http://schemas.microsoft.com/office/word/2020/wordml/sdtdatahash" xmlns:w16se="http://schemas.microsoft.com/office/word/2015/wordml/symex" mc:Ignorable="w14 w15 w16se w16cid w16 w16cex w16sdtdh">
   <w:docDefaults>
     <w:rPrDefault>
       <w:rPr>

</xml_diff>